<commit_message>
Integración de EmailJS para formulario de contacto y autorespuesta, Cambios en texto de archivos y se cambia el reporte
</commit_message>
<xml_diff>
--- a/Actividades/Parcial_1/Archivos/Actividad_3/InfomeAct3.docx
+++ b/Actividades/Parcial_1/Archivos/Actividad_3/InfomeAct3.docx
@@ -118,25 +118,7 @@
                                         <w:sz w:val="72"/>
                                         <w:szCs w:val="72"/>
                                       </w:rPr>
-                                      <w:t xml:space="preserve">Actividad 3-No presiones </w:t>
-                                    </w:r>
-                                    <w:proofErr w:type="spellStart"/>
-                                    <w:r>
-                                      <w:rPr>
-                                        <w:color w:val="4472C4" w:themeColor="accent1"/>
-                                        <w:sz w:val="72"/>
-                                        <w:szCs w:val="72"/>
-                                      </w:rPr>
-                                      <w:t>Esc</w:t>
-                                    </w:r>
-                                    <w:proofErr w:type="spellEnd"/>
-                                    <w:r>
-                                      <w:rPr>
-                                        <w:color w:val="4472C4" w:themeColor="accent1"/>
-                                        <w:sz w:val="72"/>
-                                        <w:szCs w:val="72"/>
-                                      </w:rPr>
-                                      <w:t>… todavía</w:t>
+                                      <w:t>Actividad 3-No presiones Esc… todavía</w:t>
                                     </w:r>
                                   </w:sdtContent>
                                 </w:sdt>
@@ -276,25 +258,7 @@
                                   <w:sz w:val="72"/>
                                   <w:szCs w:val="72"/>
                                 </w:rPr>
-                                <w:t xml:space="preserve">Actividad 3-No presiones </w:t>
-                              </w:r>
-                              <w:proofErr w:type="spellStart"/>
-                              <w:r>
-                                <w:rPr>
-                                  <w:color w:val="4472C4" w:themeColor="accent1"/>
-                                  <w:sz w:val="72"/>
-                                  <w:szCs w:val="72"/>
-                                </w:rPr>
-                                <w:t>Esc</w:t>
-                              </w:r>
-                              <w:proofErr w:type="spellEnd"/>
-                              <w:r>
-                                <w:rPr>
-                                  <w:color w:val="4472C4" w:themeColor="accent1"/>
-                                  <w:sz w:val="72"/>
-                                  <w:szCs w:val="72"/>
-                                </w:rPr>
-                                <w:t>… todavía</w:t>
+                                <w:t>Actividad 3-No presiones Esc… todavía</w:t>
                               </w:r>
                             </w:sdtContent>
                           </w:sdt>
@@ -572,19 +536,1097 @@
     </w:sdt>
     <w:p>
       <w:pPr>
+        <w:pStyle w:val="Ttulo1"/>
+      </w:pPr>
+      <w:r>
+        <w:lastRenderedPageBreak/>
+        <w:t>1. Resumen Ejecutivo y Objetivos</w:t>
+      </w:r>
+    </w:p>
+    <w:p>
+      <w:pPr>
+        <w:spacing w:after="0" w:line="240" w:lineRule="auto"/>
         <w:ind w:firstLine="0"/>
+        <w:rPr>
+          <w:rFonts w:ascii="Arial" w:eastAsia="Times New Roman" w:hAnsi="Arial" w:cs="Arial"/>
+          <w:sz w:val="24"/>
+          <w:szCs w:val="24"/>
+          <w:lang w:eastAsia="es-MX"/>
+        </w:rPr>
+      </w:pPr>
+      <w:r>
+        <w:rPr>
+          <w:rFonts w:ascii="Arial" w:eastAsia="Times New Roman" w:hAnsi="Arial" w:cs="Arial"/>
+          <w:sz w:val="24"/>
+          <w:szCs w:val="24"/>
+          <w:lang w:eastAsia="es-MX"/>
+        </w:rPr>
+        <w:t>E</w:t>
+      </w:r>
+      <w:r>
+        <w:rPr>
+          <w:rFonts w:ascii="Arial" w:eastAsia="Times New Roman" w:hAnsi="Arial" w:cs="Arial"/>
+          <w:sz w:val="24"/>
+          <w:szCs w:val="24"/>
+          <w:lang w:eastAsia="es-MX"/>
+        </w:rPr>
+        <w:t>n este</w:t>
+      </w:r>
+      <w:r>
+        <w:rPr>
+          <w:rFonts w:ascii="Arial" w:eastAsia="Times New Roman" w:hAnsi="Arial" w:cs="Arial"/>
+          <w:sz w:val="24"/>
+          <w:szCs w:val="24"/>
+          <w:lang w:eastAsia="es-MX"/>
+        </w:rPr>
+        <w:t xml:space="preserve"> informe </w:t>
+      </w:r>
+      <w:r>
+        <w:rPr>
+          <w:rFonts w:ascii="Arial" w:eastAsia="Times New Roman" w:hAnsi="Arial" w:cs="Arial"/>
+          <w:sz w:val="24"/>
+          <w:szCs w:val="24"/>
+          <w:lang w:eastAsia="es-MX"/>
+        </w:rPr>
+        <w:t xml:space="preserve">se </w:t>
+      </w:r>
+      <w:r>
+        <w:rPr>
+          <w:rFonts w:ascii="Arial" w:eastAsia="Times New Roman" w:hAnsi="Arial" w:cs="Arial"/>
+          <w:sz w:val="24"/>
+          <w:szCs w:val="24"/>
+          <w:lang w:eastAsia="es-MX"/>
+        </w:rPr>
+        <w:t xml:space="preserve">documenta la implementación de un programa de telemetría local basado en </w:t>
+      </w:r>
+      <w:r>
+        <w:rPr>
+          <w:rFonts w:ascii="Arial" w:eastAsia="Times New Roman" w:hAnsi="Arial" w:cs="Arial"/>
+          <w:i/>
+          <w:iCs/>
+          <w:sz w:val="24"/>
+          <w:szCs w:val="24"/>
+          <w:bdr w:val="none" w:sz="0" w:space="0" w:color="auto" w:frame="1"/>
+          <w:lang w:eastAsia="es-MX"/>
+        </w:rPr>
+        <w:t>event hooks</w:t>
+      </w:r>
+      <w:r>
+        <w:rPr>
+          <w:rFonts w:ascii="Arial" w:eastAsia="Times New Roman" w:hAnsi="Arial" w:cs="Arial"/>
+          <w:sz w:val="24"/>
+          <w:szCs w:val="24"/>
+          <w:lang w:eastAsia="es-MX"/>
+        </w:rPr>
+        <w:t xml:space="preserve"> y </w:t>
+      </w:r>
+      <w:r>
+        <w:rPr>
+          <w:rFonts w:ascii="Arial" w:eastAsia="Times New Roman" w:hAnsi="Arial" w:cs="Arial"/>
+          <w:i/>
+          <w:iCs/>
+          <w:sz w:val="24"/>
+          <w:szCs w:val="24"/>
+          <w:bdr w:val="none" w:sz="0" w:space="0" w:color="auto" w:frame="1"/>
+          <w:lang w:eastAsia="es-MX"/>
+        </w:rPr>
+        <w:t>callbacks</w:t>
+      </w:r>
+      <w:r>
+        <w:rPr>
+          <w:rFonts w:ascii="Arial" w:eastAsia="Times New Roman" w:hAnsi="Arial" w:cs="Arial"/>
+          <w:sz w:val="24"/>
+          <w:szCs w:val="24"/>
+          <w:lang w:eastAsia="es-MX"/>
+        </w:rPr>
+        <w:t>. El propósito de esta práctica es comprender a nivel técnico cómo operan las técnicas de captura de entrada de información y reconocer sus implicaciones dentro de la ciberseguridad, tanto para la monitorización legítima como para el análisis de software malicioso.</w:t>
+      </w:r>
+    </w:p>
+    <w:p>
+      <w:pPr>
+        <w:spacing w:after="0" w:line="240" w:lineRule="auto"/>
+        <w:ind w:firstLine="0"/>
+        <w:rPr>
+          <w:rFonts w:ascii="Arial" w:eastAsia="Times New Roman" w:hAnsi="Arial" w:cs="Arial"/>
+          <w:sz w:val="24"/>
+          <w:szCs w:val="24"/>
+          <w:lang w:eastAsia="es-MX"/>
+        </w:rPr>
+      </w:pPr>
+    </w:p>
+    <w:p>
+      <w:pPr>
+        <w:spacing w:after="0" w:line="240" w:lineRule="auto"/>
+        <w:ind w:firstLine="0"/>
+        <w:rPr>
+          <w:rFonts w:ascii="Arial" w:eastAsia="Times New Roman" w:hAnsi="Arial" w:cs="Arial"/>
+          <w:sz w:val="24"/>
+          <w:szCs w:val="24"/>
+          <w:lang w:eastAsia="es-MX"/>
+        </w:rPr>
+      </w:pPr>
+      <w:r>
+        <w:rPr>
+          <w:rFonts w:ascii="Arial" w:eastAsia="Times New Roman" w:hAnsi="Arial" w:cs="Arial"/>
+          <w:b/>
+          <w:bCs/>
+          <w:sz w:val="24"/>
+          <w:szCs w:val="24"/>
+          <w:bdr w:val="none" w:sz="0" w:space="0" w:color="auto" w:frame="1"/>
+          <w:lang w:eastAsia="es-MX"/>
+        </w:rPr>
+        <w:t>Objetivos Específicos:</w:t>
+      </w:r>
+    </w:p>
+    <w:p>
+      <w:pPr>
+        <w:numPr>
+          <w:ilvl w:val="0"/>
+          <w:numId w:val="2"/>
+        </w:numPr>
+        <w:spacing w:after="0" w:line="240" w:lineRule="auto"/>
+        <w:rPr>
+          <w:rFonts w:ascii="Arial" w:eastAsia="Times New Roman" w:hAnsi="Arial" w:cs="Arial"/>
+          <w:sz w:val="24"/>
+          <w:szCs w:val="24"/>
+          <w:lang w:eastAsia="es-MX"/>
+        </w:rPr>
+      </w:pPr>
+      <w:r>
+        <w:rPr>
+          <w:rFonts w:ascii="Arial" w:eastAsia="Times New Roman" w:hAnsi="Arial" w:cs="Arial"/>
+          <w:sz w:val="24"/>
+          <w:szCs w:val="24"/>
+          <w:lang w:eastAsia="es-MX"/>
+        </w:rPr>
+        <w:t>Modificar el código base para incorporar persistencia de registros en un archivo de texto.</w:t>
+      </w:r>
+    </w:p>
+    <w:p>
+      <w:pPr>
+        <w:numPr>
+          <w:ilvl w:val="0"/>
+          <w:numId w:val="2"/>
+        </w:numPr>
+        <w:spacing w:after="0" w:line="240" w:lineRule="auto"/>
+        <w:rPr>
+          <w:rFonts w:ascii="Arial" w:eastAsia="Times New Roman" w:hAnsi="Arial" w:cs="Arial"/>
+          <w:sz w:val="24"/>
+          <w:szCs w:val="24"/>
+          <w:lang w:eastAsia="es-MX"/>
+        </w:rPr>
+      </w:pPr>
+      <w:r>
+        <w:rPr>
+          <w:rFonts w:ascii="Arial" w:eastAsia="Times New Roman" w:hAnsi="Arial" w:cs="Arial"/>
+          <w:sz w:val="24"/>
+          <w:szCs w:val="24"/>
+          <w:lang w:eastAsia="es-MX"/>
+        </w:rPr>
+        <w:t>Implementar una asociación temporal (marcas de fecha y hora) para cada evento registrado.</w:t>
+      </w:r>
+    </w:p>
+    <w:p>
+      <w:pPr>
+        <w:numPr>
+          <w:ilvl w:val="0"/>
+          <w:numId w:val="2"/>
+        </w:numPr>
+        <w:spacing w:after="0" w:line="240" w:lineRule="auto"/>
+        <w:rPr>
+          <w:rFonts w:ascii="Arial" w:eastAsia="Times New Roman" w:hAnsi="Arial" w:cs="Arial"/>
+          <w:sz w:val="24"/>
+          <w:szCs w:val="24"/>
+          <w:lang w:eastAsia="es-MX"/>
+        </w:rPr>
+      </w:pPr>
+      <w:r>
+        <w:rPr>
+          <w:rFonts w:ascii="Arial" w:eastAsia="Times New Roman" w:hAnsi="Arial" w:cs="Arial"/>
+          <w:sz w:val="24"/>
+          <w:szCs w:val="24"/>
+          <w:lang w:eastAsia="es-MX"/>
+        </w:rPr>
+        <w:t>Comprobar y explicar el funcionamiento del programa mediante pruebas en un entorno controlado y análisis del código desarrollado.</w:t>
+      </w:r>
+    </w:p>
+    <w:p>
+      <w:pPr>
+        <w:spacing w:after="0" w:line="240" w:lineRule="auto"/>
+        <w:ind w:left="720" w:firstLine="0"/>
+        <w:rPr>
+          <w:rFonts w:ascii="Arial" w:eastAsia="Times New Roman" w:hAnsi="Arial" w:cs="Arial"/>
+          <w:sz w:val="24"/>
+          <w:szCs w:val="24"/>
+          <w:lang w:eastAsia="es-MX"/>
+        </w:rPr>
+      </w:pPr>
+    </w:p>
+    <w:p>
+      <w:pPr>
+        <w:pStyle w:val="Ttulo1"/>
+      </w:pPr>
+      <w:r>
+        <w:t>2. Tecnologías y Librerías Utilizadas</w:t>
+      </w:r>
+    </w:p>
+    <w:p>
+      <w:pPr>
+        <w:spacing w:after="0" w:line="240" w:lineRule="auto"/>
+        <w:ind w:firstLine="0"/>
+        <w:rPr>
+          <w:rFonts w:ascii="Arial" w:eastAsia="Times New Roman" w:hAnsi="Arial" w:cs="Arial"/>
+          <w:sz w:val="24"/>
+          <w:szCs w:val="24"/>
+          <w:lang w:eastAsia="es-MX"/>
+        </w:rPr>
+      </w:pPr>
+      <w:r>
+        <w:rPr>
+          <w:rFonts w:ascii="Arial" w:eastAsia="Times New Roman" w:hAnsi="Arial" w:cs="Arial"/>
+          <w:sz w:val="24"/>
+          <w:szCs w:val="24"/>
+          <w:lang w:eastAsia="es-MX"/>
+        </w:rPr>
+        <w:t xml:space="preserve">Para el desarrollo del script </w:t>
+      </w:r>
+      <w:r>
+        <w:rPr>
+          <w:rFonts w:ascii="Arial" w:eastAsia="Times New Roman" w:hAnsi="Arial" w:cs="Arial"/>
+          <w:sz w:val="23"/>
+          <w:szCs w:val="23"/>
+          <w:lang w:eastAsia="es-MX"/>
+        </w:rPr>
+        <w:t>UPSLPWare.py</w:t>
+      </w:r>
+      <w:r>
+        <w:rPr>
+          <w:rFonts w:ascii="Arial" w:eastAsia="Times New Roman" w:hAnsi="Arial" w:cs="Arial"/>
+          <w:sz w:val="24"/>
+          <w:szCs w:val="24"/>
+          <w:lang w:eastAsia="es-MX"/>
+        </w:rPr>
+        <w:t xml:space="preserve"> se utilizó el lenguaje Python, empleando las siguientes librerías principales:</w:t>
+      </w:r>
+    </w:p>
+    <w:p>
+      <w:pPr>
+        <w:numPr>
+          <w:ilvl w:val="0"/>
+          <w:numId w:val="3"/>
+        </w:numPr>
+        <w:spacing w:after="0" w:line="240" w:lineRule="auto"/>
+        <w:rPr>
+          <w:rFonts w:ascii="Arial" w:eastAsia="Times New Roman" w:hAnsi="Arial" w:cs="Arial"/>
+          <w:sz w:val="24"/>
+          <w:szCs w:val="24"/>
+          <w:lang w:eastAsia="es-MX"/>
+        </w:rPr>
+      </w:pPr>
+      <w:r>
+        <w:rPr>
+          <w:rFonts w:ascii="Arial" w:eastAsia="Times New Roman" w:hAnsi="Arial" w:cs="Arial"/>
+          <w:sz w:val="23"/>
+          <w:szCs w:val="23"/>
+          <w:bdr w:val="none" w:sz="0" w:space="0" w:color="auto" w:frame="1"/>
+          <w:lang w:eastAsia="es-MX"/>
+        </w:rPr>
+        <w:t>pynput.keyboard</w:t>
+      </w:r>
+      <w:r>
+        <w:rPr>
+          <w:rFonts w:ascii="Arial" w:eastAsia="Times New Roman" w:hAnsi="Arial" w:cs="Arial"/>
+          <w:sz w:val="24"/>
+          <w:szCs w:val="24"/>
+          <w:lang w:eastAsia="es-MX"/>
+        </w:rPr>
+        <w:t xml:space="preserve">: Módulo fundamental para el control y monitoreo de los dispositivos de entrada. Permite inyectar </w:t>
+      </w:r>
+      <w:r>
+        <w:rPr>
+          <w:rFonts w:ascii="Arial" w:eastAsia="Times New Roman" w:hAnsi="Arial" w:cs="Arial"/>
+          <w:i/>
+          <w:iCs/>
+          <w:sz w:val="24"/>
+          <w:szCs w:val="24"/>
+          <w:bdr w:val="none" w:sz="0" w:space="0" w:color="auto" w:frame="1"/>
+          <w:lang w:eastAsia="es-MX"/>
+        </w:rPr>
+        <w:t>hooks</w:t>
+      </w:r>
+      <w:r>
+        <w:rPr>
+          <w:rFonts w:ascii="Arial" w:eastAsia="Times New Roman" w:hAnsi="Arial" w:cs="Arial"/>
+          <w:sz w:val="24"/>
+          <w:szCs w:val="24"/>
+          <w:lang w:eastAsia="es-MX"/>
+        </w:rPr>
+        <w:t xml:space="preserve"> en el sistema operativo para interceptar las pulsaciones antes de que sean procesadas por otras aplicaciones</w:t>
+      </w:r>
+      <w:r>
+        <w:rPr>
+          <w:rFonts w:ascii="Arial" w:eastAsia="Times New Roman" w:hAnsi="Arial" w:cs="Arial"/>
+          <w:sz w:val="24"/>
+          <w:szCs w:val="24"/>
+          <w:lang w:eastAsia="es-MX"/>
+        </w:rPr>
+        <w:t>.</w:t>
+      </w:r>
+    </w:p>
+    <w:p>
+      <w:pPr>
+        <w:numPr>
+          <w:ilvl w:val="0"/>
+          <w:numId w:val="3"/>
+        </w:numPr>
+        <w:spacing w:after="0" w:line="240" w:lineRule="auto"/>
+        <w:rPr>
+          <w:rFonts w:ascii="Arial" w:eastAsia="Times New Roman" w:hAnsi="Arial" w:cs="Arial"/>
+          <w:sz w:val="24"/>
+          <w:szCs w:val="24"/>
+          <w:lang w:eastAsia="es-MX"/>
+        </w:rPr>
+      </w:pPr>
+      <w:r>
+        <w:rPr>
+          <w:rFonts w:ascii="Arial" w:eastAsia="Times New Roman" w:hAnsi="Arial" w:cs="Arial"/>
+          <w:sz w:val="23"/>
+          <w:szCs w:val="23"/>
+          <w:bdr w:val="none" w:sz="0" w:space="0" w:color="auto" w:frame="1"/>
+          <w:lang w:eastAsia="es-MX"/>
+        </w:rPr>
+        <w:t>datetime</w:t>
+      </w:r>
+      <w:r>
+        <w:rPr>
+          <w:rFonts w:ascii="Arial" w:eastAsia="Times New Roman" w:hAnsi="Arial" w:cs="Arial"/>
+          <w:sz w:val="24"/>
+          <w:szCs w:val="24"/>
+          <w:lang w:eastAsia="es-MX"/>
+        </w:rPr>
+        <w:t>: Librería estándar utilizada para generar las marcas temporales (</w:t>
+      </w:r>
+      <w:r>
+        <w:rPr>
+          <w:rFonts w:ascii="Arial" w:eastAsia="Times New Roman" w:hAnsi="Arial" w:cs="Arial"/>
+          <w:i/>
+          <w:iCs/>
+          <w:sz w:val="24"/>
+          <w:szCs w:val="24"/>
+          <w:bdr w:val="none" w:sz="0" w:space="0" w:color="auto" w:frame="1"/>
+          <w:lang w:eastAsia="es-MX"/>
+        </w:rPr>
+        <w:t>timestamps</w:t>
+      </w:r>
+      <w:r>
+        <w:rPr>
+          <w:rFonts w:ascii="Arial" w:eastAsia="Times New Roman" w:hAnsi="Arial" w:cs="Arial"/>
+          <w:sz w:val="24"/>
+          <w:szCs w:val="24"/>
+          <w:lang w:eastAsia="es-MX"/>
+        </w:rPr>
+        <w:t>) con precisión de milisegundos, garantizando la correcta asociación temporal de cada evento.</w:t>
+      </w:r>
+    </w:p>
+    <w:p>
+      <w:pPr>
+        <w:spacing w:after="0" w:line="240" w:lineRule="auto"/>
+        <w:ind w:left="720" w:firstLine="0"/>
+        <w:rPr>
+          <w:rFonts w:ascii="Arial" w:eastAsia="Times New Roman" w:hAnsi="Arial" w:cs="Arial"/>
+          <w:sz w:val="24"/>
+          <w:szCs w:val="24"/>
+          <w:lang w:eastAsia="es-MX"/>
+        </w:rPr>
+      </w:pPr>
+    </w:p>
+    <w:p>
+      <w:pPr>
+        <w:pStyle w:val="Ttulo1"/>
+      </w:pPr>
+      <w:r>
+        <w:t>3. Análisis del Código Fuente</w:t>
+      </w:r>
+    </w:p>
+    <w:p>
+      <w:pPr>
+        <w:spacing w:after="0" w:line="240" w:lineRule="auto"/>
+        <w:ind w:firstLine="0"/>
+        <w:rPr>
+          <w:rFonts w:ascii="Arial" w:eastAsia="Times New Roman" w:hAnsi="Arial" w:cs="Arial"/>
+          <w:sz w:val="24"/>
+          <w:szCs w:val="24"/>
+          <w:lang w:eastAsia="es-MX"/>
+        </w:rPr>
+      </w:pPr>
+      <w:r>
+        <w:rPr>
+          <w:rFonts w:ascii="Arial" w:eastAsia="Times New Roman" w:hAnsi="Arial" w:cs="Arial"/>
+          <w:sz w:val="24"/>
+          <w:szCs w:val="24"/>
+          <w:lang w:eastAsia="es-MX"/>
+        </w:rPr>
+        <w:t xml:space="preserve">El diseño del software se basa en la programación orientada a eventos, delegando la ejecución a dos funciones </w:t>
+      </w:r>
+      <w:r>
+        <w:rPr>
+          <w:rFonts w:ascii="Arial" w:eastAsia="Times New Roman" w:hAnsi="Arial" w:cs="Arial"/>
+          <w:i/>
+          <w:iCs/>
+          <w:sz w:val="24"/>
+          <w:szCs w:val="24"/>
+          <w:bdr w:val="none" w:sz="0" w:space="0" w:color="auto" w:frame="1"/>
+          <w:lang w:eastAsia="es-MX"/>
+        </w:rPr>
+        <w:t>callback</w:t>
+      </w:r>
+      <w:r>
+        <w:rPr>
+          <w:rFonts w:ascii="Arial" w:eastAsia="Times New Roman" w:hAnsi="Arial" w:cs="Arial"/>
+          <w:sz w:val="24"/>
+          <w:szCs w:val="24"/>
+          <w:lang w:eastAsia="es-MX"/>
+        </w:rPr>
+        <w:t xml:space="preserve"> principales:</w:t>
+      </w:r>
+    </w:p>
+    <w:p>
+      <w:pPr>
+        <w:spacing w:after="0" w:line="240" w:lineRule="auto"/>
+        <w:ind w:firstLine="0"/>
+        <w:rPr>
+          <w:rFonts w:ascii="Arial" w:eastAsia="Times New Roman" w:hAnsi="Arial" w:cs="Arial"/>
+          <w:sz w:val="24"/>
+          <w:szCs w:val="24"/>
+          <w:lang w:eastAsia="es-MX"/>
+        </w:rPr>
+      </w:pPr>
+      <w:r>
+        <w:rPr>
+          <w:rFonts w:ascii="Arial" w:eastAsia="Times New Roman" w:hAnsi="Arial" w:cs="Arial"/>
+          <w:sz w:val="24"/>
+          <w:szCs w:val="24"/>
+          <w:lang w:eastAsia="es-MX"/>
+        </w:rPr>
+        <w:br/>
+      </w:r>
+    </w:p>
+    <w:p>
+      <w:pPr>
+        <w:pStyle w:val="Ttulo2"/>
+      </w:pPr>
+      <w:r>
+        <w:t>3.1. Función de Intercepción (</w:t>
+      </w:r>
+      <w:r>
+        <w:rPr>
+          <w:rFonts w:eastAsiaTheme="minorEastAsia"/>
+          <w:b w:val="0"/>
+          <w:bCs w:val="0"/>
+          <w:sz w:val="23"/>
+          <w:szCs w:val="23"/>
+        </w:rPr>
+        <w:t>on_press</w:t>
+      </w:r>
+      <w:r>
+        <w:t>)</w:t>
+      </w:r>
+    </w:p>
+    <w:p>
+      <w:pPr>
+        <w:spacing w:after="0" w:line="240" w:lineRule="auto"/>
+        <w:ind w:firstLine="0"/>
+        <w:rPr>
+          <w:rFonts w:ascii="Arial" w:eastAsia="Times New Roman" w:hAnsi="Arial" w:cs="Arial"/>
+          <w:sz w:val="24"/>
+          <w:szCs w:val="24"/>
+          <w:lang w:eastAsia="es-MX"/>
+        </w:rPr>
+      </w:pPr>
+      <w:r>
+        <w:rPr>
+          <w:rFonts w:ascii="Arial" w:eastAsia="Times New Roman" w:hAnsi="Arial" w:cs="Arial"/>
+          <w:sz w:val="24"/>
+          <w:szCs w:val="24"/>
+          <w:lang w:eastAsia="es-MX"/>
+        </w:rPr>
+        <w:t>Esta función es invocada automáticamente por el sistema cada vez que se detecta una pulsación. Su flujo lógico es el siguiente:</w:t>
+      </w:r>
+    </w:p>
+    <w:p>
+      <w:pPr>
+        <w:spacing w:after="0" w:line="240" w:lineRule="auto"/>
+        <w:ind w:firstLine="0"/>
+        <w:rPr>
+          <w:rFonts w:ascii="Arial" w:eastAsia="Times New Roman" w:hAnsi="Arial" w:cs="Arial"/>
+          <w:sz w:val="24"/>
+          <w:szCs w:val="24"/>
+          <w:lang w:eastAsia="es-MX"/>
+        </w:rPr>
+      </w:pPr>
+    </w:p>
+    <w:p>
+      <w:pPr>
+        <w:numPr>
+          <w:ilvl w:val="0"/>
+          <w:numId w:val="4"/>
+        </w:numPr>
+        <w:spacing w:after="0" w:line="240" w:lineRule="auto"/>
+        <w:rPr>
+          <w:rFonts w:ascii="Arial" w:eastAsia="Times New Roman" w:hAnsi="Arial" w:cs="Arial"/>
+          <w:sz w:val="24"/>
+          <w:szCs w:val="24"/>
+          <w:lang w:eastAsia="es-MX"/>
+        </w:rPr>
+      </w:pPr>
+      <w:r>
+        <w:rPr>
+          <w:rFonts w:ascii="Arial" w:eastAsia="Times New Roman" w:hAnsi="Arial" w:cs="Arial"/>
+          <w:b/>
+          <w:bCs/>
+          <w:sz w:val="24"/>
+          <w:szCs w:val="24"/>
+          <w:bdr w:val="none" w:sz="0" w:space="0" w:color="auto" w:frame="1"/>
+          <w:lang w:eastAsia="es-MX"/>
+        </w:rPr>
+        <w:t>Asociación Temporal:</w:t>
+      </w:r>
+      <w:r>
+        <w:rPr>
+          <w:rFonts w:ascii="Arial" w:eastAsia="Times New Roman" w:hAnsi="Arial" w:cs="Arial"/>
+          <w:sz w:val="24"/>
+          <w:szCs w:val="24"/>
+          <w:lang w:eastAsia="es-MX"/>
+        </w:rPr>
+        <w:t xml:space="preserve"> Se genera una cadena de texto con la fecha y hora exacta de la ejecución mediante </w:t>
+      </w:r>
+      <w:r>
+        <w:rPr>
+          <w:rFonts w:ascii="Arial" w:eastAsia="Times New Roman" w:hAnsi="Arial" w:cs="Arial"/>
+          <w:sz w:val="23"/>
+          <w:szCs w:val="23"/>
+          <w:lang w:eastAsia="es-MX"/>
+        </w:rPr>
+        <w:t>datetime.now().strftime("%Y-%m-%d %H:%M:%S.%f")[:-3]</w:t>
+      </w:r>
+      <w:r>
+        <w:rPr>
+          <w:rFonts w:ascii="Arial" w:eastAsia="Times New Roman" w:hAnsi="Arial" w:cs="Arial"/>
+          <w:sz w:val="24"/>
+          <w:szCs w:val="24"/>
+          <w:lang w:eastAsia="es-MX"/>
+        </w:rPr>
+        <w:t>.</w:t>
+      </w:r>
+    </w:p>
+    <w:p>
+      <w:pPr>
+        <w:spacing w:after="0" w:line="240" w:lineRule="auto"/>
+        <w:ind w:left="720" w:firstLine="0"/>
+        <w:rPr>
+          <w:rFonts w:ascii="Arial" w:eastAsia="Times New Roman" w:hAnsi="Arial" w:cs="Arial"/>
+          <w:sz w:val="24"/>
+          <w:szCs w:val="24"/>
+          <w:lang w:eastAsia="es-MX"/>
+        </w:rPr>
+      </w:pPr>
+    </w:p>
+    <w:p>
+      <w:pPr>
+        <w:numPr>
+          <w:ilvl w:val="0"/>
+          <w:numId w:val="4"/>
+        </w:numPr>
+        <w:spacing w:after="0" w:line="240" w:lineRule="auto"/>
+        <w:rPr>
+          <w:rFonts w:ascii="Arial" w:eastAsia="Times New Roman" w:hAnsi="Arial" w:cs="Arial"/>
+          <w:sz w:val="24"/>
+          <w:szCs w:val="24"/>
+          <w:lang w:eastAsia="es-MX"/>
+        </w:rPr>
+      </w:pPr>
+      <w:r>
+        <w:rPr>
+          <w:rFonts w:ascii="Arial" w:eastAsia="Times New Roman" w:hAnsi="Arial" w:cs="Arial"/>
+          <w:b/>
+          <w:bCs/>
+          <w:sz w:val="24"/>
+          <w:szCs w:val="24"/>
+          <w:bdr w:val="none" w:sz="0" w:space="0" w:color="auto" w:frame="1"/>
+          <w:lang w:eastAsia="es-MX"/>
+        </w:rPr>
+        <w:t>Clasificación de Entrada:</w:t>
+      </w:r>
+      <w:r>
+        <w:rPr>
+          <w:rFonts w:ascii="Arial" w:eastAsia="Times New Roman" w:hAnsi="Arial" w:cs="Arial"/>
+          <w:sz w:val="24"/>
+          <w:szCs w:val="24"/>
+          <w:lang w:eastAsia="es-MX"/>
+        </w:rPr>
+        <w:t xml:space="preserve"> Se emplea un bloque </w:t>
+      </w:r>
+      <w:r>
+        <w:rPr>
+          <w:rFonts w:ascii="Arial" w:eastAsia="Times New Roman" w:hAnsi="Arial" w:cs="Arial"/>
+          <w:sz w:val="23"/>
+          <w:szCs w:val="23"/>
+          <w:lang w:eastAsia="es-MX"/>
+        </w:rPr>
+        <w:t>try-except</w:t>
+      </w:r>
+      <w:r>
+        <w:rPr>
+          <w:rFonts w:ascii="Arial" w:eastAsia="Times New Roman" w:hAnsi="Arial" w:cs="Arial"/>
+          <w:sz w:val="24"/>
+          <w:szCs w:val="24"/>
+          <w:lang w:eastAsia="es-MX"/>
+        </w:rPr>
+        <w:t xml:space="preserve"> para determinar la naturaleza de la tecla. Si es un carácter estándar (alfanumérico), se extrae su valor (key.char). Si es una tecla especial (como </w:t>
+      </w:r>
+      <w:r>
+        <w:rPr>
+          <w:rFonts w:ascii="Arial" w:eastAsia="Times New Roman" w:hAnsi="Arial" w:cs="Arial"/>
+          <w:i/>
+          <w:iCs/>
+          <w:sz w:val="24"/>
+          <w:szCs w:val="24"/>
+          <w:bdr w:val="none" w:sz="0" w:space="0" w:color="auto" w:frame="1"/>
+          <w:lang w:eastAsia="es-MX"/>
+        </w:rPr>
+        <w:t>Shift</w:t>
+      </w:r>
+      <w:r>
+        <w:rPr>
+          <w:rFonts w:ascii="Arial" w:eastAsia="Times New Roman" w:hAnsi="Arial" w:cs="Arial"/>
+          <w:sz w:val="24"/>
+          <w:szCs w:val="24"/>
+          <w:lang w:eastAsia="es-MX"/>
+        </w:rPr>
+        <w:t xml:space="preserve">, </w:t>
+      </w:r>
+      <w:r>
+        <w:rPr>
+          <w:rFonts w:ascii="Arial" w:eastAsia="Times New Roman" w:hAnsi="Arial" w:cs="Arial"/>
+          <w:i/>
+          <w:iCs/>
+          <w:sz w:val="24"/>
+          <w:szCs w:val="24"/>
+          <w:bdr w:val="none" w:sz="0" w:space="0" w:color="auto" w:frame="1"/>
+          <w:lang w:eastAsia="es-MX"/>
+        </w:rPr>
+        <w:t>Enter</w:t>
+      </w:r>
+      <w:r>
+        <w:rPr>
+          <w:rFonts w:ascii="Arial" w:eastAsia="Times New Roman" w:hAnsi="Arial" w:cs="Arial"/>
+          <w:sz w:val="24"/>
+          <w:szCs w:val="24"/>
+          <w:lang w:eastAsia="es-MX"/>
+        </w:rPr>
+        <w:t xml:space="preserve"> o </w:t>
+      </w:r>
+      <w:r>
+        <w:rPr>
+          <w:rFonts w:ascii="Arial" w:eastAsia="Times New Roman" w:hAnsi="Arial" w:cs="Arial"/>
+          <w:i/>
+          <w:iCs/>
+          <w:sz w:val="24"/>
+          <w:szCs w:val="24"/>
+          <w:bdr w:val="none" w:sz="0" w:space="0" w:color="auto" w:frame="1"/>
+          <w:lang w:eastAsia="es-MX"/>
+        </w:rPr>
+        <w:t>Tab</w:t>
+      </w:r>
+      <w:r>
+        <w:rPr>
+          <w:rFonts w:ascii="Arial" w:eastAsia="Times New Roman" w:hAnsi="Arial" w:cs="Arial"/>
+          <w:sz w:val="24"/>
+          <w:szCs w:val="24"/>
+          <w:lang w:eastAsia="es-MX"/>
+        </w:rPr>
+        <w:t>), se captura el error de atributo y se registra el nombre propio de la tecla.</w:t>
+      </w:r>
+    </w:p>
+    <w:p>
+      <w:pPr>
+        <w:spacing w:after="0" w:line="240" w:lineRule="auto"/>
+        <w:ind w:left="720" w:firstLine="0"/>
+        <w:rPr>
+          <w:rFonts w:ascii="Arial" w:eastAsia="Times New Roman" w:hAnsi="Arial" w:cs="Arial"/>
+          <w:sz w:val="24"/>
+          <w:szCs w:val="24"/>
+          <w:lang w:eastAsia="es-MX"/>
+        </w:rPr>
+      </w:pPr>
+    </w:p>
+    <w:p>
+      <w:pPr>
+        <w:numPr>
+          <w:ilvl w:val="0"/>
+          <w:numId w:val="4"/>
+        </w:numPr>
+        <w:spacing w:after="0" w:line="240" w:lineRule="auto"/>
+        <w:rPr>
+          <w:rFonts w:ascii="Arial" w:eastAsia="Times New Roman" w:hAnsi="Arial" w:cs="Arial"/>
+          <w:sz w:val="24"/>
+          <w:szCs w:val="24"/>
+          <w:lang w:eastAsia="es-MX"/>
+        </w:rPr>
+      </w:pPr>
+      <w:r>
+        <w:rPr>
+          <w:rFonts w:ascii="Arial" w:eastAsia="Times New Roman" w:hAnsi="Arial" w:cs="Arial"/>
+          <w:b/>
+          <w:bCs/>
+          <w:sz w:val="24"/>
+          <w:szCs w:val="24"/>
+          <w:bdr w:val="none" w:sz="0" w:space="0" w:color="auto" w:frame="1"/>
+          <w:lang w:eastAsia="es-MX"/>
+        </w:rPr>
+        <w:lastRenderedPageBreak/>
+        <w:t>Persistencia Local:</w:t>
+      </w:r>
+      <w:r>
+        <w:rPr>
+          <w:rFonts w:ascii="Arial" w:eastAsia="Times New Roman" w:hAnsi="Arial" w:cs="Arial"/>
+          <w:sz w:val="24"/>
+          <w:szCs w:val="24"/>
+          <w:lang w:eastAsia="es-MX"/>
+        </w:rPr>
+        <w:t xml:space="preserve"> Se formatea una variable </w:t>
+      </w:r>
+      <w:r>
+        <w:rPr>
+          <w:rFonts w:ascii="Arial" w:eastAsia="Times New Roman" w:hAnsi="Arial" w:cs="Arial"/>
+          <w:sz w:val="23"/>
+          <w:szCs w:val="23"/>
+          <w:lang w:eastAsia="es-MX"/>
+        </w:rPr>
+        <w:t>registro</w:t>
+      </w:r>
+      <w:r>
+        <w:rPr>
+          <w:rFonts w:ascii="Arial" w:eastAsia="Times New Roman" w:hAnsi="Arial" w:cs="Arial"/>
+          <w:sz w:val="24"/>
+          <w:szCs w:val="24"/>
+          <w:lang w:eastAsia="es-MX"/>
+        </w:rPr>
+        <w:t xml:space="preserve"> y se utiliza el manejador de contexto </w:t>
+      </w:r>
+      <w:r>
+        <w:rPr>
+          <w:rFonts w:ascii="Arial" w:eastAsia="Times New Roman" w:hAnsi="Arial" w:cs="Arial"/>
+          <w:sz w:val="23"/>
+          <w:szCs w:val="23"/>
+          <w:lang w:eastAsia="es-MX"/>
+        </w:rPr>
+        <w:t>with open("Caracteres.txt", "a")</w:t>
+      </w:r>
+      <w:r>
+        <w:rPr>
+          <w:rFonts w:ascii="Arial" w:eastAsia="Times New Roman" w:hAnsi="Arial" w:cs="Arial"/>
+          <w:sz w:val="24"/>
+          <w:szCs w:val="24"/>
+          <w:lang w:eastAsia="es-MX"/>
+        </w:rPr>
+        <w:t xml:space="preserve">. El modo </w:t>
+      </w:r>
+      <w:r>
+        <w:rPr>
+          <w:rFonts w:ascii="Arial" w:eastAsia="Times New Roman" w:hAnsi="Arial" w:cs="Arial"/>
+          <w:sz w:val="23"/>
+          <w:szCs w:val="23"/>
+          <w:lang w:eastAsia="es-MX"/>
+        </w:rPr>
+        <w:t>a</w:t>
+      </w:r>
+      <w:r>
+        <w:rPr>
+          <w:rFonts w:ascii="Arial" w:eastAsia="Times New Roman" w:hAnsi="Arial" w:cs="Arial"/>
+          <w:sz w:val="24"/>
+          <w:szCs w:val="24"/>
+          <w:lang w:eastAsia="es-MX"/>
+        </w:rPr>
+        <w:t xml:space="preserve"> (</w:t>
+      </w:r>
+      <w:r>
+        <w:rPr>
+          <w:rFonts w:ascii="Arial" w:eastAsia="Times New Roman" w:hAnsi="Arial" w:cs="Arial"/>
+          <w:i/>
+          <w:iCs/>
+          <w:sz w:val="24"/>
+          <w:szCs w:val="24"/>
+          <w:bdr w:val="none" w:sz="0" w:space="0" w:color="auto" w:frame="1"/>
+          <w:lang w:eastAsia="es-MX"/>
+        </w:rPr>
+        <w:t>append</w:t>
+      </w:r>
+      <w:r>
+        <w:rPr>
+          <w:rFonts w:ascii="Arial" w:eastAsia="Times New Roman" w:hAnsi="Arial" w:cs="Arial"/>
+          <w:sz w:val="24"/>
+          <w:szCs w:val="24"/>
+          <w:lang w:eastAsia="es-MX"/>
+        </w:rPr>
+        <w:t xml:space="preserve">) es </w:t>
+      </w:r>
+      <w:r>
+        <w:rPr>
+          <w:rFonts w:ascii="Arial" w:eastAsia="Times New Roman" w:hAnsi="Arial" w:cs="Arial"/>
+          <w:sz w:val="24"/>
+          <w:szCs w:val="24"/>
+          <w:lang w:eastAsia="es-MX"/>
+        </w:rPr>
+        <w:t>esencia</w:t>
+      </w:r>
+      <w:r>
+        <w:rPr>
+          <w:rFonts w:ascii="Arial" w:eastAsia="Times New Roman" w:hAnsi="Arial" w:cs="Arial"/>
+          <w:sz w:val="24"/>
+          <w:szCs w:val="24"/>
+          <w:lang w:eastAsia="es-MX"/>
+        </w:rPr>
+        <w:t>l, ya que permite añadir nuevos registros al final del archivo sin sobrescribir la información capturada previamente.</w:t>
+      </w:r>
+    </w:p>
+    <w:p>
+      <w:pPr>
+        <w:spacing w:after="0" w:line="240" w:lineRule="auto"/>
+        <w:ind w:left="720" w:firstLine="0"/>
+        <w:rPr>
+          <w:rFonts w:ascii="Arial" w:eastAsia="Times New Roman" w:hAnsi="Arial" w:cs="Arial"/>
+          <w:sz w:val="24"/>
+          <w:szCs w:val="24"/>
+          <w:lang w:eastAsia="es-MX"/>
+        </w:rPr>
+      </w:pPr>
+    </w:p>
+    <w:p>
+      <w:pPr>
+        <w:spacing w:after="0" w:line="240" w:lineRule="auto"/>
+        <w:ind w:firstLine="0"/>
+        <w:outlineLvl w:val="2"/>
+        <w:rPr>
+          <w:rFonts w:ascii="Arial" w:eastAsia="Times New Roman" w:hAnsi="Arial" w:cs="Arial"/>
+          <w:b/>
+          <w:bCs/>
+          <w:sz w:val="27"/>
+          <w:szCs w:val="27"/>
+          <w:lang w:eastAsia="es-MX"/>
+        </w:rPr>
+      </w:pPr>
+      <w:r>
+        <w:rPr>
+          <w:rFonts w:ascii="Arial" w:eastAsia="Times New Roman" w:hAnsi="Arial" w:cs="Arial"/>
+          <w:b/>
+          <w:bCs/>
+          <w:sz w:val="27"/>
+          <w:szCs w:val="27"/>
+          <w:lang w:eastAsia="es-MX"/>
+        </w:rPr>
+        <w:t>3.2. Condición de Salida (</w:t>
+      </w:r>
+      <w:r>
+        <w:rPr>
+          <w:rFonts w:ascii="Arial" w:eastAsia="Times New Roman" w:hAnsi="Arial" w:cs="Arial"/>
+          <w:sz w:val="23"/>
+          <w:szCs w:val="23"/>
+          <w:lang w:eastAsia="es-MX"/>
+        </w:rPr>
+        <w:t>on_release</w:t>
+      </w:r>
+      <w:r>
+        <w:rPr>
+          <w:rFonts w:ascii="Arial" w:eastAsia="Times New Roman" w:hAnsi="Arial" w:cs="Arial"/>
+          <w:b/>
+          <w:bCs/>
+          <w:sz w:val="27"/>
+          <w:szCs w:val="27"/>
+          <w:lang w:eastAsia="es-MX"/>
+        </w:rPr>
+        <w:t>)</w:t>
+      </w:r>
+    </w:p>
+    <w:p>
+      <w:pPr>
+        <w:spacing w:after="0" w:line="240" w:lineRule="auto"/>
+        <w:ind w:firstLine="0"/>
+        <w:rPr>
+          <w:rFonts w:ascii="Arial" w:eastAsia="Times New Roman" w:hAnsi="Arial" w:cs="Arial"/>
+          <w:sz w:val="24"/>
+          <w:szCs w:val="24"/>
+          <w:lang w:eastAsia="es-MX"/>
+        </w:rPr>
+      </w:pPr>
+      <w:r>
+        <w:rPr>
+          <w:rFonts w:ascii="Arial" w:eastAsia="Times New Roman" w:hAnsi="Arial" w:cs="Arial"/>
+          <w:sz w:val="24"/>
+          <w:szCs w:val="24"/>
+          <w:lang w:eastAsia="es-MX"/>
+        </w:rPr>
+        <w:t xml:space="preserve">Para mantener el control sobre la ejecución del script, la función </w:t>
+      </w:r>
+      <w:r>
+        <w:rPr>
+          <w:rFonts w:ascii="Arial" w:eastAsia="Times New Roman" w:hAnsi="Arial" w:cs="Arial"/>
+          <w:sz w:val="23"/>
+          <w:szCs w:val="23"/>
+          <w:lang w:eastAsia="es-MX"/>
+        </w:rPr>
+        <w:t>on_release</w:t>
+      </w:r>
+      <w:r>
+        <w:rPr>
+          <w:rFonts w:ascii="Arial" w:eastAsia="Times New Roman" w:hAnsi="Arial" w:cs="Arial"/>
+          <w:sz w:val="24"/>
+          <w:szCs w:val="24"/>
+          <w:lang w:eastAsia="es-MX"/>
+        </w:rPr>
+        <w:t xml:space="preserve"> evalúa la tecla liberada. Si la tecla corresponde a </w:t>
+      </w:r>
+      <w:r>
+        <w:rPr>
+          <w:rFonts w:ascii="Arial" w:eastAsia="Times New Roman" w:hAnsi="Arial" w:cs="Arial"/>
+          <w:sz w:val="23"/>
+          <w:szCs w:val="23"/>
+          <w:lang w:eastAsia="es-MX"/>
+        </w:rPr>
+        <w:t>Key.esc</w:t>
+      </w:r>
+      <w:r>
+        <w:rPr>
+          <w:rFonts w:ascii="Arial" w:eastAsia="Times New Roman" w:hAnsi="Arial" w:cs="Arial"/>
+          <w:sz w:val="24"/>
+          <w:szCs w:val="24"/>
+          <w:lang w:eastAsia="es-MX"/>
+        </w:rPr>
+        <w:t xml:space="preserve">, la función retorna </w:t>
+      </w:r>
+      <w:r>
+        <w:rPr>
+          <w:rFonts w:ascii="Arial" w:eastAsia="Times New Roman" w:hAnsi="Arial" w:cs="Arial"/>
+          <w:sz w:val="23"/>
+          <w:szCs w:val="23"/>
+          <w:lang w:eastAsia="es-MX"/>
+        </w:rPr>
+        <w:t>False</w:t>
+      </w:r>
+      <w:r>
+        <w:rPr>
+          <w:rFonts w:ascii="Arial" w:eastAsia="Times New Roman" w:hAnsi="Arial" w:cs="Arial"/>
+          <w:sz w:val="24"/>
+          <w:szCs w:val="24"/>
+          <w:lang w:eastAsia="es-MX"/>
+        </w:rPr>
+        <w:t xml:space="preserve">, lo que rompe el ciclo del </w:t>
+      </w:r>
+      <w:r>
+        <w:rPr>
+          <w:rFonts w:ascii="Arial" w:eastAsia="Times New Roman" w:hAnsi="Arial" w:cs="Arial"/>
+          <w:i/>
+          <w:iCs/>
+          <w:sz w:val="24"/>
+          <w:szCs w:val="24"/>
+          <w:bdr w:val="none" w:sz="0" w:space="0" w:color="auto" w:frame="1"/>
+          <w:lang w:eastAsia="es-MX"/>
+        </w:rPr>
+        <w:t>Listener</w:t>
+      </w:r>
+      <w:r>
+        <w:rPr>
+          <w:rFonts w:ascii="Arial" w:eastAsia="Times New Roman" w:hAnsi="Arial" w:cs="Arial"/>
+          <w:sz w:val="24"/>
+          <w:szCs w:val="24"/>
+          <w:lang w:eastAsia="es-MX"/>
+        </w:rPr>
+        <w:t xml:space="preserve"> y finaliza el programa de manera segura.</w:t>
+      </w:r>
+    </w:p>
+    <w:p>
+      <w:pPr>
+        <w:spacing w:after="0" w:line="240" w:lineRule="auto"/>
+        <w:ind w:firstLine="0"/>
+        <w:rPr>
+          <w:rFonts w:ascii="Arial" w:eastAsia="Times New Roman" w:hAnsi="Arial" w:cs="Arial"/>
+          <w:sz w:val="24"/>
+          <w:szCs w:val="24"/>
+          <w:lang w:eastAsia="es-MX"/>
+        </w:rPr>
+      </w:pPr>
+      <w:r>
+        <w:rPr>
+          <w:rFonts w:ascii="Arial" w:eastAsia="Times New Roman" w:hAnsi="Arial" w:cs="Arial"/>
+          <w:sz w:val="24"/>
+          <w:szCs w:val="24"/>
+          <w:lang w:eastAsia="es-MX"/>
+        </w:rPr>
+        <w:br/>
+      </w:r>
+    </w:p>
+    <w:p>
+      <w:pPr>
+        <w:pStyle w:val="Ttulo1"/>
+      </w:pPr>
+      <w:r>
+        <w:t>4. Evidencias de Ejecución y Pruebas</w:t>
+      </w:r>
+    </w:p>
+    <w:p>
+      <w:pPr>
+        <w:spacing w:after="0" w:line="240" w:lineRule="auto"/>
+        <w:ind w:firstLine="0"/>
+        <w:rPr>
+          <w:rFonts w:ascii="Arial" w:eastAsia="Times New Roman" w:hAnsi="Arial" w:cs="Arial"/>
+          <w:sz w:val="24"/>
+          <w:szCs w:val="24"/>
+          <w:lang w:eastAsia="es-MX"/>
+        </w:rPr>
+      </w:pPr>
+      <w:r>
+        <w:rPr>
+          <w:rFonts w:ascii="Arial" w:eastAsia="Times New Roman" w:hAnsi="Arial" w:cs="Arial"/>
+          <w:sz w:val="24"/>
+          <w:szCs w:val="24"/>
+          <w:lang w:eastAsia="es-MX"/>
+        </w:rPr>
+        <w:t>A continuación, se demuestra el funcionamiento del programa tras su ejecución en el entorno local.</w:t>
+      </w:r>
+    </w:p>
+    <w:p>
+      <w:pPr>
+        <w:spacing w:after="0" w:line="240" w:lineRule="auto"/>
+        <w:ind w:firstLine="0"/>
+        <w:rPr>
+          <w:rFonts w:ascii="Arial" w:eastAsia="Times New Roman" w:hAnsi="Arial" w:cs="Arial"/>
+          <w:sz w:val="24"/>
+          <w:szCs w:val="24"/>
+          <w:lang w:eastAsia="es-MX"/>
+        </w:rPr>
+      </w:pPr>
+    </w:p>
+    <w:p>
+      <w:pPr>
+        <w:spacing w:after="0" w:line="240" w:lineRule="auto"/>
+        <w:ind w:firstLine="0"/>
+        <w:rPr>
+          <w:rFonts w:ascii="Arial" w:eastAsia="Times New Roman" w:hAnsi="Arial" w:cs="Arial"/>
+          <w:sz w:val="24"/>
+          <w:szCs w:val="24"/>
+          <w:lang w:eastAsia="es-MX"/>
+        </w:rPr>
       </w:pPr>
       <w:r>
         <w:rPr>
           <w:noProof/>
           <w14:ligatures w14:val="standardContextual"/>
         </w:rPr>
-        <w:lastRenderedPageBreak/>
         <w:drawing>
-          <wp:inline distT="0" distB="0" distL="0" distR="0" wp14:anchorId="14BDAD2C" wp14:editId="4BA933E5">
+          <wp:inline distT="0" distB="0" distL="0" distR="0" wp14:anchorId="1FA544AF" wp14:editId="2248ADA4">
             <wp:extent cx="4895850" cy="1990725"/>
             <wp:effectExtent l="0" t="0" r="0" b="9525"/>
-            <wp:docPr id="1992303484" name="Imagen 1" descr="Interfaz de usuario gráfica, Texto, Chat o mensaje de texto&#10;&#10;Descripción generada automáticamente"/>
+            <wp:docPr id="944038754" name="Imagen 1" descr="Interfaz de usuario gráfica, Texto, Chat o mensaje de texto&#10;&#10;Descripción generada automáticamente"/>
             <wp:cNvGraphicFramePr>
               <a:graphicFrameLocks xmlns:a="http://schemas.openxmlformats.org/drawingml/2006/main" noChangeAspect="1"/>
             </wp:cNvGraphicFramePr>
@@ -596,7 +1638,7 @@
                     <pic:cNvPicPr/>
                   </pic:nvPicPr>
                   <pic:blipFill>
-                    <a:blip r:embed="rId5"/>
+                    <a:blip r:embed="rId6"/>
                     <a:stretch>
                       <a:fillRect/>
                     </a:stretch>
@@ -619,57 +1661,130 @@
     </w:p>
     <w:p>
       <w:pPr>
+        <w:spacing w:after="0" w:line="240" w:lineRule="auto"/>
         <w:ind w:firstLine="0"/>
+        <w:rPr>
+          <w:rFonts w:ascii="Arial" w:eastAsia="Times New Roman" w:hAnsi="Arial" w:cs="Arial"/>
+          <w:sz w:val="24"/>
+          <w:szCs w:val="24"/>
+          <w:lang w:eastAsia="es-MX"/>
+        </w:rPr>
+      </w:pPr>
+      <w:r>
+        <w:rPr>
+          <w:rFonts w:ascii="Arial" w:eastAsia="Times New Roman" w:hAnsi="Arial" w:cs="Arial"/>
+          <w:b/>
+          <w:bCs/>
+          <w:sz w:val="24"/>
+          <w:szCs w:val="24"/>
+          <w:bdr w:val="none" w:sz="0" w:space="0" w:color="auto" w:frame="1"/>
+          <w:lang w:eastAsia="es-MX"/>
+        </w:rPr>
+        <w:t>Figura 1.</w:t>
+      </w:r>
+      <w:r>
+        <w:rPr>
+          <w:rFonts w:ascii="Arial" w:eastAsia="Times New Roman" w:hAnsi="Arial" w:cs="Arial"/>
+          <w:sz w:val="24"/>
+          <w:szCs w:val="24"/>
+          <w:lang w:eastAsia="es-MX"/>
+        </w:rPr>
+        <w:t xml:space="preserve"> Ejecución del script </w:t>
+      </w:r>
+      <w:r>
+        <w:rPr>
+          <w:rFonts w:ascii="Arial" w:eastAsia="Times New Roman" w:hAnsi="Arial" w:cs="Arial"/>
+          <w:sz w:val="23"/>
+          <w:szCs w:val="23"/>
+          <w:lang w:eastAsia="es-MX"/>
+        </w:rPr>
+        <w:t>UPSLPWare.py</w:t>
+      </w:r>
+      <w:r>
+        <w:rPr>
+          <w:rFonts w:ascii="Arial" w:eastAsia="Times New Roman" w:hAnsi="Arial" w:cs="Arial"/>
+          <w:sz w:val="24"/>
+          <w:szCs w:val="24"/>
+          <w:lang w:eastAsia="es-MX"/>
+        </w:rPr>
+        <w:t xml:space="preserve"> en el entorno </w:t>
+      </w:r>
+      <w:r>
+        <w:rPr>
+          <w:rFonts w:ascii="Arial" w:eastAsia="Times New Roman" w:hAnsi="Arial" w:cs="Arial"/>
+          <w:sz w:val="24"/>
+          <w:szCs w:val="24"/>
+          <w:lang w:eastAsia="es-MX"/>
+        </w:rPr>
+        <w:t>local.</w:t>
+      </w:r>
+    </w:p>
+    <w:p>
+      <w:pPr>
+        <w:spacing w:after="0" w:line="240" w:lineRule="auto"/>
+        <w:ind w:firstLine="0"/>
+        <w:rPr>
+          <w:rFonts w:ascii="Arial" w:eastAsia="Times New Roman" w:hAnsi="Arial" w:cs="Arial"/>
+          <w:sz w:val="24"/>
+          <w:szCs w:val="24"/>
+          <w:lang w:eastAsia="es-MX"/>
+        </w:rPr>
+      </w:pPr>
+    </w:p>
+    <w:p>
+      <w:pPr>
+        <w:spacing w:after="0" w:line="240" w:lineRule="auto"/>
+        <w:ind w:firstLine="0"/>
+        <w:rPr>
+          <w:rFonts w:ascii="Arial" w:eastAsia="Times New Roman" w:hAnsi="Arial" w:cs="Arial"/>
+          <w:sz w:val="24"/>
+          <w:szCs w:val="24"/>
+          <w:lang w:eastAsia="es-MX"/>
+        </w:rPr>
+      </w:pPr>
+      <w:r>
+        <w:rPr>
+          <w:rFonts w:ascii="Arial" w:eastAsia="Times New Roman" w:hAnsi="Arial" w:cs="Arial"/>
+          <w:sz w:val="24"/>
+          <w:szCs w:val="24"/>
+          <w:lang w:eastAsia="es-MX"/>
+        </w:rPr>
+        <w:t>Una vez iniciada la escucha, se procedió a teclear información de prueba para verificar la correcta intercepción, formateo y escritura en el archivo de destino.</w:t>
+      </w:r>
+    </w:p>
+    <w:p>
+      <w:pPr>
+        <w:spacing w:after="0" w:line="240" w:lineRule="auto"/>
+        <w:ind w:firstLine="0"/>
+        <w:rPr>
+          <w:rFonts w:ascii="Arial" w:eastAsia="Times New Roman" w:hAnsi="Arial" w:cs="Arial"/>
+          <w:sz w:val="24"/>
+          <w:szCs w:val="24"/>
+          <w:lang w:eastAsia="es-MX"/>
+        </w:rPr>
+      </w:pPr>
+    </w:p>
+    <w:p>
+      <w:pPr>
+        <w:spacing w:after="0" w:line="240" w:lineRule="auto"/>
+        <w:ind w:firstLine="0"/>
+        <w:rPr>
+          <w:rFonts w:ascii="Arial" w:eastAsia="Times New Roman" w:hAnsi="Arial" w:cs="Arial"/>
+          <w:sz w:val="24"/>
+          <w:szCs w:val="24"/>
+          <w:lang w:eastAsia="es-MX"/>
+        </w:rPr>
       </w:pPr>
       <w:r>
         <w:rPr>
           <w:noProof/>
         </w:rPr>
+        <w:lastRenderedPageBreak/>
         <w:drawing>
-          <wp:inline distT="0" distB="0" distL="0" distR="0" wp14:anchorId="41E162E0" wp14:editId="1362A170">
-            <wp:extent cx="5612130" cy="691515"/>
-            <wp:effectExtent l="0" t="0" r="7620" b="0"/>
-            <wp:docPr id="1965832791" name="Imagen 1" descr="Interfaz de usuario gráfica, Texto, Aplicación&#10;&#10;Descripción generada automáticamente"/>
-            <wp:cNvGraphicFramePr>
-              <a:graphicFrameLocks xmlns:a="http://schemas.openxmlformats.org/drawingml/2006/main" noChangeAspect="1"/>
-            </wp:cNvGraphicFramePr>
-            <a:graphic xmlns:a="http://schemas.openxmlformats.org/drawingml/2006/main">
-              <a:graphicData uri="http://schemas.openxmlformats.org/drawingml/2006/picture">
-                <pic:pic xmlns:pic="http://schemas.openxmlformats.org/drawingml/2006/picture">
-                  <pic:nvPicPr>
-                    <pic:cNvPr id="1965832791" name="Imagen 1" descr="Interfaz de usuario gráfica, Texto, Aplicación&#10;&#10;Descripción generada automáticamente"/>
-                    <pic:cNvPicPr/>
-                  </pic:nvPicPr>
-                  <pic:blipFill>
-                    <a:blip r:embed="rId6"/>
-                    <a:stretch>
-                      <a:fillRect/>
-                    </a:stretch>
-                  </pic:blipFill>
-                  <pic:spPr>
-                    <a:xfrm>
-                      <a:off x="0" y="0"/>
-                      <a:ext cx="5612130" cy="691515"/>
-                    </a:xfrm>
-                    <a:prstGeom prst="rect">
-                      <a:avLst/>
-                    </a:prstGeom>
-                  </pic:spPr>
-                </pic:pic>
-              </a:graphicData>
-            </a:graphic>
-          </wp:inline>
-        </w:drawing>
-      </w:r>
-      <w:r>
-        <w:rPr>
-          <w:noProof/>
-        </w:rPr>
-        <w:drawing>
-          <wp:inline distT="0" distB="0" distL="0" distR="0" wp14:anchorId="1AA1A20A" wp14:editId="45D219D9">
-            <wp:extent cx="3781953" cy="4610743"/>
-            <wp:effectExtent l="0" t="0" r="9525" b="0"/>
-            <wp:docPr id="1195413106" name="Imagen 1" descr="Tabla&#10;&#10;Descripción generada automáticamente"/>
+          <wp:inline distT="0" distB="0" distL="0" distR="0" wp14:anchorId="6890E310" wp14:editId="380AD42B">
+            <wp:extent cx="3781425" cy="4455994"/>
+            <wp:effectExtent l="0" t="0" r="0" b="1905"/>
+            <wp:docPr id="593646783" name="Imagen 1" descr="Tabla&#10;&#10;Descripción generada automáticamente"/>
             <wp:cNvGraphicFramePr>
               <a:graphicFrameLocks xmlns:a="http://schemas.openxmlformats.org/drawingml/2006/main" noChangeAspect="1"/>
             </wp:cNvGraphicFramePr>
@@ -680,20 +1795,27 @@
                     <pic:cNvPr id="1195413106" name="Imagen 1" descr="Tabla&#10;&#10;Descripción generada automáticamente"/>
                     <pic:cNvPicPr/>
                   </pic:nvPicPr>
-                  <pic:blipFill>
+                  <pic:blipFill rotWithShape="1">
                     <a:blip r:embed="rId7"/>
-                    <a:stretch>
-                      <a:fillRect/>
-                    </a:stretch>
+                    <a:srcRect b="3342"/>
+                    <a:stretch/>
                   </pic:blipFill>
-                  <pic:spPr>
+                  <pic:spPr bwMode="auto">
                     <a:xfrm>
                       <a:off x="0" y="0"/>
-                      <a:ext cx="3781953" cy="4610743"/>
+                      <a:ext cx="3781953" cy="4456616"/>
                     </a:xfrm>
                     <a:prstGeom prst="rect">
                       <a:avLst/>
                     </a:prstGeom>
+                    <a:ln>
+                      <a:noFill/>
+                    </a:ln>
+                    <a:extLst>
+                      <a:ext uri="{53640926-AAD7-44D8-BBD7-CCE9431645EC}">
+                        <a14:shadowObscured xmlns:a14="http://schemas.microsoft.com/office/drawing/2010/main"/>
+                      </a:ext>
+                    </a:extLst>
                   </pic:spPr>
                 </pic:pic>
               </a:graphicData>
@@ -701,6 +1823,226 @@
           </wp:inline>
         </w:drawing>
       </w:r>
+    </w:p>
+    <w:p>
+      <w:pPr>
+        <w:spacing w:after="0" w:line="240" w:lineRule="auto"/>
+        <w:ind w:firstLine="0"/>
+        <w:rPr>
+          <w:rFonts w:ascii="Arial" w:eastAsia="Times New Roman" w:hAnsi="Arial" w:cs="Arial"/>
+          <w:sz w:val="24"/>
+          <w:szCs w:val="24"/>
+          <w:lang w:eastAsia="es-MX"/>
+        </w:rPr>
+      </w:pPr>
+      <w:r>
+        <w:rPr>
+          <w:rFonts w:ascii="Arial" w:eastAsia="Times New Roman" w:hAnsi="Arial" w:cs="Arial"/>
+          <w:b/>
+          <w:bCs/>
+          <w:sz w:val="24"/>
+          <w:szCs w:val="24"/>
+          <w:bdr w:val="none" w:sz="0" w:space="0" w:color="auto" w:frame="1"/>
+          <w:lang w:eastAsia="es-MX"/>
+        </w:rPr>
+        <w:t>Figura 2.</w:t>
+      </w:r>
+      <w:r>
+        <w:rPr>
+          <w:rFonts w:ascii="Arial" w:eastAsia="Times New Roman" w:hAnsi="Arial" w:cs="Arial"/>
+          <w:sz w:val="24"/>
+          <w:szCs w:val="24"/>
+          <w:lang w:eastAsia="es-MX"/>
+        </w:rPr>
+        <w:t xml:space="preserve"> Archivo </w:t>
+      </w:r>
+      <w:r>
+        <w:rPr>
+          <w:rFonts w:ascii="Arial" w:eastAsia="Times New Roman" w:hAnsi="Arial" w:cs="Arial"/>
+          <w:sz w:val="23"/>
+          <w:szCs w:val="23"/>
+          <w:lang w:eastAsia="es-MX"/>
+        </w:rPr>
+        <w:t>Caracteres.txt</w:t>
+      </w:r>
+      <w:r>
+        <w:rPr>
+          <w:rFonts w:ascii="Arial" w:eastAsia="Times New Roman" w:hAnsi="Arial" w:cs="Arial"/>
+          <w:sz w:val="24"/>
+          <w:szCs w:val="24"/>
+          <w:lang w:eastAsia="es-MX"/>
+        </w:rPr>
+        <w:t xml:space="preserve"> mostrando la persistencia de los datos, el identificador de evento secuencial y la asociación temporal precisa.</w:t>
+      </w:r>
+    </w:p>
+    <w:p>
+      <w:pPr>
+        <w:spacing w:after="0" w:line="240" w:lineRule="auto"/>
+        <w:ind w:firstLine="0"/>
+        <w:rPr>
+          <w:rFonts w:ascii="Arial" w:eastAsia="Times New Roman" w:hAnsi="Arial" w:cs="Arial"/>
+          <w:sz w:val="24"/>
+          <w:szCs w:val="24"/>
+          <w:lang w:eastAsia="es-MX"/>
+        </w:rPr>
+      </w:pPr>
+      <w:r>
+        <w:rPr>
+          <w:rFonts w:ascii="Arial" w:eastAsia="Times New Roman" w:hAnsi="Arial" w:cs="Arial"/>
+          <w:sz w:val="24"/>
+          <w:szCs w:val="24"/>
+          <w:lang w:eastAsia="es-MX"/>
+        </w:rPr>
+        <w:br/>
+      </w:r>
+    </w:p>
+    <w:p>
+      <w:pPr>
+        <w:pStyle w:val="Ttulo1"/>
+      </w:pPr>
+      <w:r>
+        <w:t>5. Conclusiones y Aplicación en Ciberseguridad</w:t>
+      </w:r>
+    </w:p>
+    <w:p>
+      <w:pPr>
+        <w:spacing w:after="0" w:line="240" w:lineRule="auto"/>
+        <w:ind w:firstLine="0"/>
+        <w:rPr>
+          <w:rFonts w:ascii="Arial" w:eastAsia="Times New Roman" w:hAnsi="Arial" w:cs="Arial"/>
+          <w:sz w:val="24"/>
+          <w:szCs w:val="24"/>
+          <w:lang w:eastAsia="es-MX"/>
+        </w:rPr>
+      </w:pPr>
+      <w:r>
+        <w:rPr>
+          <w:rFonts w:ascii="Arial" w:eastAsia="Times New Roman" w:hAnsi="Arial" w:cs="Arial"/>
+          <w:sz w:val="24"/>
+          <w:szCs w:val="24"/>
+          <w:lang w:eastAsia="es-MX"/>
+        </w:rPr>
+        <w:t xml:space="preserve">A través de la implementación de </w:t>
+      </w:r>
+      <w:r>
+        <w:rPr>
+          <w:rFonts w:ascii="Arial" w:eastAsia="Times New Roman" w:hAnsi="Arial" w:cs="Arial"/>
+          <w:sz w:val="23"/>
+          <w:szCs w:val="23"/>
+          <w:lang w:eastAsia="es-MX"/>
+        </w:rPr>
+        <w:t>UPSLPWare.py</w:t>
+      </w:r>
+      <w:r>
+        <w:rPr>
+          <w:rFonts w:ascii="Arial" w:eastAsia="Times New Roman" w:hAnsi="Arial" w:cs="Arial"/>
+          <w:sz w:val="24"/>
+          <w:szCs w:val="24"/>
+          <w:lang w:eastAsia="es-MX"/>
+        </w:rPr>
+        <w:t>, se evidenció la facilidad con la que un lenguaje de alto nivel puede interactuar con las APIs del sistema operativo para interceptar periféricos.</w:t>
+      </w:r>
+    </w:p>
+    <w:p>
+      <w:pPr>
+        <w:spacing w:after="0" w:line="240" w:lineRule="auto"/>
+        <w:ind w:firstLine="0"/>
+        <w:rPr>
+          <w:rFonts w:ascii="Arial" w:eastAsia="Times New Roman" w:hAnsi="Arial" w:cs="Arial"/>
+          <w:sz w:val="24"/>
+          <w:szCs w:val="24"/>
+          <w:lang w:eastAsia="es-MX"/>
+        </w:rPr>
+      </w:pPr>
+    </w:p>
+    <w:p>
+      <w:pPr>
+        <w:spacing w:after="0" w:line="240" w:lineRule="auto"/>
+        <w:ind w:firstLine="0"/>
+        <w:rPr>
+          <w:rFonts w:ascii="Arial" w:eastAsia="Times New Roman" w:hAnsi="Arial" w:cs="Arial"/>
+          <w:sz w:val="24"/>
+          <w:szCs w:val="24"/>
+          <w:lang w:eastAsia="es-MX"/>
+        </w:rPr>
+      </w:pPr>
+      <w:r>
+        <w:rPr>
+          <w:rFonts w:ascii="Arial" w:eastAsia="Times New Roman" w:hAnsi="Arial" w:cs="Arial"/>
+          <w:sz w:val="24"/>
+          <w:szCs w:val="24"/>
+          <w:lang w:eastAsia="es-MX"/>
+        </w:rPr>
+        <w:t>Al lograr registrar la entrada del usuario de manera persistente y asociarla con marcas temporales precisas</w:t>
+      </w:r>
+      <w:r>
+        <w:rPr>
+          <w:rFonts w:ascii="Arial" w:eastAsia="Times New Roman" w:hAnsi="Arial" w:cs="Arial"/>
+          <w:sz w:val="24"/>
+          <w:szCs w:val="24"/>
+          <w:lang w:eastAsia="es-MX"/>
+        </w:rPr>
+        <w:t xml:space="preserve"> se puede</w:t>
+      </w:r>
+      <w:r>
+        <w:rPr>
+          <w:rFonts w:ascii="Arial" w:eastAsia="Times New Roman" w:hAnsi="Arial" w:cs="Arial"/>
+          <w:sz w:val="24"/>
+          <w:szCs w:val="24"/>
+          <w:lang w:eastAsia="es-MX"/>
+        </w:rPr>
+        <w:t xml:space="preserve"> </w:t>
+      </w:r>
+      <w:r>
+        <w:rPr>
+          <w:rFonts w:ascii="Arial" w:eastAsia="Times New Roman" w:hAnsi="Arial" w:cs="Arial"/>
+          <w:sz w:val="24"/>
+          <w:szCs w:val="24"/>
+          <w:lang w:eastAsia="es-MX"/>
+        </w:rPr>
+        <w:t>e</w:t>
+      </w:r>
+      <w:r>
+        <w:rPr>
+          <w:rFonts w:ascii="Arial" w:eastAsia="Times New Roman" w:hAnsi="Arial" w:cs="Arial"/>
+          <w:sz w:val="24"/>
+          <w:szCs w:val="24"/>
+          <w:lang w:eastAsia="es-MX"/>
+        </w:rPr>
+        <w:t xml:space="preserve">ntender </w:t>
+      </w:r>
+      <w:r>
+        <w:rPr>
+          <w:rFonts w:ascii="Arial" w:eastAsia="Times New Roman" w:hAnsi="Arial" w:cs="Arial"/>
+          <w:sz w:val="24"/>
+          <w:szCs w:val="24"/>
+          <w:lang w:eastAsia="es-MX"/>
+        </w:rPr>
+        <w:t xml:space="preserve">un poco </w:t>
+      </w:r>
+      <w:r>
+        <w:rPr>
+          <w:rFonts w:ascii="Arial" w:eastAsia="Times New Roman" w:hAnsi="Arial" w:cs="Arial"/>
+          <w:sz w:val="24"/>
+          <w:szCs w:val="24"/>
+          <w:lang w:eastAsia="es-MX"/>
+        </w:rPr>
+        <w:t>cómo un atacante puede estructurar, capturar y ocultar el flujo de datos locales</w:t>
+      </w:r>
+      <w:r>
+        <w:rPr>
+          <w:rFonts w:ascii="Arial" w:eastAsia="Times New Roman" w:hAnsi="Arial" w:cs="Arial"/>
+          <w:sz w:val="24"/>
+          <w:szCs w:val="24"/>
+          <w:lang w:eastAsia="es-MX"/>
+        </w:rPr>
+        <w:t>.</w:t>
+      </w:r>
+    </w:p>
+    <w:p>
+      <w:pPr>
+        <w:ind w:firstLine="0"/>
+      </w:pPr>
     </w:p>
     <w:sectPr>
       <w:pgSz w:w="12240" w:h="15840"/>
@@ -712,6 +2054,583 @@
     </w:sectPr>
   </w:body>
 </w:document>
+</file>
+
+<file path=word/numbering.xml><?xml version="1.0" encoding="utf-8"?>
+<w:numbering xmlns:wpc="http://schemas.microsoft.com/office/word/2010/wordprocessingCanvas" xmlns:cx="http://schemas.microsoft.com/office/drawing/2014/chartex" xmlns:cx1="http://schemas.microsoft.com/office/drawing/2015/9/8/chartex" xmlns:cx2="http://schemas.microsoft.com/office/drawing/2015/10/21/chartex" xmlns:cx3="http://schemas.microsoft.com/office/drawing/2016/5/9/chartex" xmlns:cx4="http://schemas.microsoft.com/office/drawing/2016/5/10/chartex" xmlns:cx5="http://schemas.microsoft.com/office/drawing/2016/5/11/chartex" xmlns:cx6="http://schemas.microsoft.com/office/drawing/2016/5/12/chartex" xmlns:cx7="http://schemas.microsoft.com/office/drawing/2016/5/13/chartex" xmlns:cx8="http://schemas.microsoft.com/office/drawing/2016/5/14/chartex" xmlns:mc="http://schemas.openxmlformats.org/markup-compatibility/2006" xmlns:aink="http://schemas.microsoft.com/office/drawing/2016/ink" xmlns:am3d="http://schemas.microsoft.com/office/drawing/2017/model3d" xmlns:o="urn:schemas-microsoft-com:office:office" xmlns:oel="http://schemas.microsoft.com/office/2019/extlst" xmlns:r="http://schemas.openxmlformats.org/officeDocument/2006/relationships" xmlns:m="http://schemas.openxmlformats.org/officeDocument/2006/math" xmlns:v="urn:schemas-microsoft-com:vml" xmlns:wp14="http://schemas.microsoft.com/office/word/2010/wordprocessingDrawing" xmlns:wp="http://schemas.openxmlformats.org/drawingml/2006/wordprocessingDrawing" xmlns:w10="urn:schemas-microsoft-com:office:word" xmlns:w="http://schemas.openxmlformats.org/wordprocessingml/2006/main" xmlns:w14="http://schemas.microsoft.com/office/word/2010/wordml" xmlns:w15="http://schemas.microsoft.com/office/word/2012/wordml" xmlns:w16cex="http://schemas.microsoft.com/office/word/2018/wordml/cex" xmlns:w16cid="http://schemas.microsoft.com/office/word/2016/wordml/cid" xmlns:w16="http://schemas.microsoft.com/office/word/2018/wordml" xmlns:w16du="http://schemas.microsoft.com/office/word/2023/wordml/word16du" xmlns:w16sdtdh="http://schemas.microsoft.com/office/word/2020/wordml/sdtdatahash" xmlns:w16se="http://schemas.microsoft.com/office/word/2015/wordml/symex" xmlns:wpg="http://schemas.microsoft.com/office/word/2010/wordprocessingGroup" xmlns:wpi="http://schemas.microsoft.com/office/word/2010/wordprocessingInk" xmlns:wne="http://schemas.microsoft.com/office/word/2006/wordml" xmlns:wps="http://schemas.microsoft.com/office/word/2010/wordprocessingShape" mc:Ignorable="w14 w15 w16se w16cid w16 w16cex w16sdtdh w16du wp14">
+  <w:abstractNum w:abstractNumId="0" w15:restartNumberingAfterBreak="0">
+    <w:nsid w:val="0EDC43BD"/>
+    <w:multiLevelType w:val="multilevel"/>
+    <w:tmpl w:val="F072E6F0"/>
+    <w:lvl w:ilvl="0">
+      <w:start w:val="1"/>
+      <w:numFmt w:val="bullet"/>
+      <w:lvlText w:val=""/>
+      <w:lvlJc w:val="left"/>
+      <w:pPr>
+        <w:tabs>
+          <w:tab w:val="num" w:pos="720"/>
+        </w:tabs>
+        <w:ind w:left="720" w:hanging="360"/>
+      </w:pPr>
+      <w:rPr>
+        <w:rFonts w:ascii="Symbol" w:hAnsi="Symbol" w:hint="default"/>
+        <w:sz w:val="20"/>
+      </w:rPr>
+    </w:lvl>
+    <w:lvl w:ilvl="1" w:tentative="1">
+      <w:start w:val="1"/>
+      <w:numFmt w:val="bullet"/>
+      <w:lvlText w:val="o"/>
+      <w:lvlJc w:val="left"/>
+      <w:pPr>
+        <w:tabs>
+          <w:tab w:val="num" w:pos="1440"/>
+        </w:tabs>
+        <w:ind w:left="1440" w:hanging="360"/>
+      </w:pPr>
+      <w:rPr>
+        <w:rFonts w:ascii="Courier New" w:hAnsi="Courier New" w:hint="default"/>
+        <w:sz w:val="20"/>
+      </w:rPr>
+    </w:lvl>
+    <w:lvl w:ilvl="2" w:tentative="1">
+      <w:start w:val="1"/>
+      <w:numFmt w:val="bullet"/>
+      <w:lvlText w:val=""/>
+      <w:lvlJc w:val="left"/>
+      <w:pPr>
+        <w:tabs>
+          <w:tab w:val="num" w:pos="2160"/>
+        </w:tabs>
+        <w:ind w:left="2160" w:hanging="360"/>
+      </w:pPr>
+      <w:rPr>
+        <w:rFonts w:ascii="Wingdings" w:hAnsi="Wingdings" w:hint="default"/>
+        <w:sz w:val="20"/>
+      </w:rPr>
+    </w:lvl>
+    <w:lvl w:ilvl="3" w:tentative="1">
+      <w:start w:val="1"/>
+      <w:numFmt w:val="bullet"/>
+      <w:lvlText w:val=""/>
+      <w:lvlJc w:val="left"/>
+      <w:pPr>
+        <w:tabs>
+          <w:tab w:val="num" w:pos="2880"/>
+        </w:tabs>
+        <w:ind w:left="2880" w:hanging="360"/>
+      </w:pPr>
+      <w:rPr>
+        <w:rFonts w:ascii="Wingdings" w:hAnsi="Wingdings" w:hint="default"/>
+        <w:sz w:val="20"/>
+      </w:rPr>
+    </w:lvl>
+    <w:lvl w:ilvl="4" w:tentative="1">
+      <w:start w:val="1"/>
+      <w:numFmt w:val="bullet"/>
+      <w:lvlText w:val=""/>
+      <w:lvlJc w:val="left"/>
+      <w:pPr>
+        <w:tabs>
+          <w:tab w:val="num" w:pos="3600"/>
+        </w:tabs>
+        <w:ind w:left="3600" w:hanging="360"/>
+      </w:pPr>
+      <w:rPr>
+        <w:rFonts w:ascii="Wingdings" w:hAnsi="Wingdings" w:hint="default"/>
+        <w:sz w:val="20"/>
+      </w:rPr>
+    </w:lvl>
+    <w:lvl w:ilvl="5" w:tentative="1">
+      <w:start w:val="1"/>
+      <w:numFmt w:val="bullet"/>
+      <w:lvlText w:val=""/>
+      <w:lvlJc w:val="left"/>
+      <w:pPr>
+        <w:tabs>
+          <w:tab w:val="num" w:pos="4320"/>
+        </w:tabs>
+        <w:ind w:left="4320" w:hanging="360"/>
+      </w:pPr>
+      <w:rPr>
+        <w:rFonts w:ascii="Wingdings" w:hAnsi="Wingdings" w:hint="default"/>
+        <w:sz w:val="20"/>
+      </w:rPr>
+    </w:lvl>
+    <w:lvl w:ilvl="6" w:tentative="1">
+      <w:start w:val="1"/>
+      <w:numFmt w:val="bullet"/>
+      <w:lvlText w:val=""/>
+      <w:lvlJc w:val="left"/>
+      <w:pPr>
+        <w:tabs>
+          <w:tab w:val="num" w:pos="5040"/>
+        </w:tabs>
+        <w:ind w:left="5040" w:hanging="360"/>
+      </w:pPr>
+      <w:rPr>
+        <w:rFonts w:ascii="Wingdings" w:hAnsi="Wingdings" w:hint="default"/>
+        <w:sz w:val="20"/>
+      </w:rPr>
+    </w:lvl>
+    <w:lvl w:ilvl="7" w:tentative="1">
+      <w:start w:val="1"/>
+      <w:numFmt w:val="bullet"/>
+      <w:lvlText w:val=""/>
+      <w:lvlJc w:val="left"/>
+      <w:pPr>
+        <w:tabs>
+          <w:tab w:val="num" w:pos="5760"/>
+        </w:tabs>
+        <w:ind w:left="5760" w:hanging="360"/>
+      </w:pPr>
+      <w:rPr>
+        <w:rFonts w:ascii="Wingdings" w:hAnsi="Wingdings" w:hint="default"/>
+        <w:sz w:val="20"/>
+      </w:rPr>
+    </w:lvl>
+    <w:lvl w:ilvl="8" w:tentative="1">
+      <w:start w:val="1"/>
+      <w:numFmt w:val="bullet"/>
+      <w:lvlText w:val=""/>
+      <w:lvlJc w:val="left"/>
+      <w:pPr>
+        <w:tabs>
+          <w:tab w:val="num" w:pos="6480"/>
+        </w:tabs>
+        <w:ind w:left="6480" w:hanging="360"/>
+      </w:pPr>
+      <w:rPr>
+        <w:rFonts w:ascii="Wingdings" w:hAnsi="Wingdings" w:hint="default"/>
+        <w:sz w:val="20"/>
+      </w:rPr>
+    </w:lvl>
+  </w:abstractNum>
+  <w:abstractNum w:abstractNumId="1" w15:restartNumberingAfterBreak="0">
+    <w:nsid w:val="326917E8"/>
+    <w:multiLevelType w:val="multilevel"/>
+    <w:tmpl w:val="964E97C8"/>
+    <w:lvl w:ilvl="0">
+      <w:start w:val="1"/>
+      <w:numFmt w:val="bullet"/>
+      <w:lvlText w:val=""/>
+      <w:lvlJc w:val="left"/>
+      <w:pPr>
+        <w:tabs>
+          <w:tab w:val="num" w:pos="720"/>
+        </w:tabs>
+        <w:ind w:left="720" w:hanging="360"/>
+      </w:pPr>
+      <w:rPr>
+        <w:rFonts w:ascii="Symbol" w:hAnsi="Symbol" w:hint="default"/>
+        <w:sz w:val="20"/>
+      </w:rPr>
+    </w:lvl>
+    <w:lvl w:ilvl="1" w:tentative="1">
+      <w:start w:val="1"/>
+      <w:numFmt w:val="bullet"/>
+      <w:lvlText w:val="o"/>
+      <w:lvlJc w:val="left"/>
+      <w:pPr>
+        <w:tabs>
+          <w:tab w:val="num" w:pos="1440"/>
+        </w:tabs>
+        <w:ind w:left="1440" w:hanging="360"/>
+      </w:pPr>
+      <w:rPr>
+        <w:rFonts w:ascii="Courier New" w:hAnsi="Courier New" w:hint="default"/>
+        <w:sz w:val="20"/>
+      </w:rPr>
+    </w:lvl>
+    <w:lvl w:ilvl="2" w:tentative="1">
+      <w:start w:val="1"/>
+      <w:numFmt w:val="bullet"/>
+      <w:lvlText w:val=""/>
+      <w:lvlJc w:val="left"/>
+      <w:pPr>
+        <w:tabs>
+          <w:tab w:val="num" w:pos="2160"/>
+        </w:tabs>
+        <w:ind w:left="2160" w:hanging="360"/>
+      </w:pPr>
+      <w:rPr>
+        <w:rFonts w:ascii="Wingdings" w:hAnsi="Wingdings" w:hint="default"/>
+        <w:sz w:val="20"/>
+      </w:rPr>
+    </w:lvl>
+    <w:lvl w:ilvl="3" w:tentative="1">
+      <w:start w:val="1"/>
+      <w:numFmt w:val="bullet"/>
+      <w:lvlText w:val=""/>
+      <w:lvlJc w:val="left"/>
+      <w:pPr>
+        <w:tabs>
+          <w:tab w:val="num" w:pos="2880"/>
+        </w:tabs>
+        <w:ind w:left="2880" w:hanging="360"/>
+      </w:pPr>
+      <w:rPr>
+        <w:rFonts w:ascii="Wingdings" w:hAnsi="Wingdings" w:hint="default"/>
+        <w:sz w:val="20"/>
+      </w:rPr>
+    </w:lvl>
+    <w:lvl w:ilvl="4" w:tentative="1">
+      <w:start w:val="1"/>
+      <w:numFmt w:val="bullet"/>
+      <w:lvlText w:val=""/>
+      <w:lvlJc w:val="left"/>
+      <w:pPr>
+        <w:tabs>
+          <w:tab w:val="num" w:pos="3600"/>
+        </w:tabs>
+        <w:ind w:left="3600" w:hanging="360"/>
+      </w:pPr>
+      <w:rPr>
+        <w:rFonts w:ascii="Wingdings" w:hAnsi="Wingdings" w:hint="default"/>
+        <w:sz w:val="20"/>
+      </w:rPr>
+    </w:lvl>
+    <w:lvl w:ilvl="5" w:tentative="1">
+      <w:start w:val="1"/>
+      <w:numFmt w:val="bullet"/>
+      <w:lvlText w:val=""/>
+      <w:lvlJc w:val="left"/>
+      <w:pPr>
+        <w:tabs>
+          <w:tab w:val="num" w:pos="4320"/>
+        </w:tabs>
+        <w:ind w:left="4320" w:hanging="360"/>
+      </w:pPr>
+      <w:rPr>
+        <w:rFonts w:ascii="Wingdings" w:hAnsi="Wingdings" w:hint="default"/>
+        <w:sz w:val="20"/>
+      </w:rPr>
+    </w:lvl>
+    <w:lvl w:ilvl="6" w:tentative="1">
+      <w:start w:val="1"/>
+      <w:numFmt w:val="bullet"/>
+      <w:lvlText w:val=""/>
+      <w:lvlJc w:val="left"/>
+      <w:pPr>
+        <w:tabs>
+          <w:tab w:val="num" w:pos="5040"/>
+        </w:tabs>
+        <w:ind w:left="5040" w:hanging="360"/>
+      </w:pPr>
+      <w:rPr>
+        <w:rFonts w:ascii="Wingdings" w:hAnsi="Wingdings" w:hint="default"/>
+        <w:sz w:val="20"/>
+      </w:rPr>
+    </w:lvl>
+    <w:lvl w:ilvl="7" w:tentative="1">
+      <w:start w:val="1"/>
+      <w:numFmt w:val="bullet"/>
+      <w:lvlText w:val=""/>
+      <w:lvlJc w:val="left"/>
+      <w:pPr>
+        <w:tabs>
+          <w:tab w:val="num" w:pos="5760"/>
+        </w:tabs>
+        <w:ind w:left="5760" w:hanging="360"/>
+      </w:pPr>
+      <w:rPr>
+        <w:rFonts w:ascii="Wingdings" w:hAnsi="Wingdings" w:hint="default"/>
+        <w:sz w:val="20"/>
+      </w:rPr>
+    </w:lvl>
+    <w:lvl w:ilvl="8" w:tentative="1">
+      <w:start w:val="1"/>
+      <w:numFmt w:val="bullet"/>
+      <w:lvlText w:val=""/>
+      <w:lvlJc w:val="left"/>
+      <w:pPr>
+        <w:tabs>
+          <w:tab w:val="num" w:pos="6480"/>
+        </w:tabs>
+        <w:ind w:left="6480" w:hanging="360"/>
+      </w:pPr>
+      <w:rPr>
+        <w:rFonts w:ascii="Wingdings" w:hAnsi="Wingdings" w:hint="default"/>
+        <w:sz w:val="20"/>
+      </w:rPr>
+    </w:lvl>
+  </w:abstractNum>
+  <w:abstractNum w:abstractNumId="2" w15:restartNumberingAfterBreak="0">
+    <w:nsid w:val="55264A84"/>
+    <w:multiLevelType w:val="multilevel"/>
+    <w:tmpl w:val="BE0E93A8"/>
+    <w:lvl w:ilvl="0">
+      <w:start w:val="1"/>
+      <w:numFmt w:val="bullet"/>
+      <w:lvlText w:val=""/>
+      <w:lvlJc w:val="left"/>
+      <w:pPr>
+        <w:tabs>
+          <w:tab w:val="num" w:pos="720"/>
+        </w:tabs>
+        <w:ind w:left="720" w:hanging="360"/>
+      </w:pPr>
+      <w:rPr>
+        <w:rFonts w:ascii="Symbol" w:hAnsi="Symbol" w:hint="default"/>
+        <w:sz w:val="20"/>
+      </w:rPr>
+    </w:lvl>
+    <w:lvl w:ilvl="1" w:tentative="1">
+      <w:start w:val="1"/>
+      <w:numFmt w:val="bullet"/>
+      <w:lvlText w:val="o"/>
+      <w:lvlJc w:val="left"/>
+      <w:pPr>
+        <w:tabs>
+          <w:tab w:val="num" w:pos="1440"/>
+        </w:tabs>
+        <w:ind w:left="1440" w:hanging="360"/>
+      </w:pPr>
+      <w:rPr>
+        <w:rFonts w:ascii="Courier New" w:hAnsi="Courier New" w:hint="default"/>
+        <w:sz w:val="20"/>
+      </w:rPr>
+    </w:lvl>
+    <w:lvl w:ilvl="2" w:tentative="1">
+      <w:start w:val="1"/>
+      <w:numFmt w:val="bullet"/>
+      <w:lvlText w:val=""/>
+      <w:lvlJc w:val="left"/>
+      <w:pPr>
+        <w:tabs>
+          <w:tab w:val="num" w:pos="2160"/>
+        </w:tabs>
+        <w:ind w:left="2160" w:hanging="360"/>
+      </w:pPr>
+      <w:rPr>
+        <w:rFonts w:ascii="Wingdings" w:hAnsi="Wingdings" w:hint="default"/>
+        <w:sz w:val="20"/>
+      </w:rPr>
+    </w:lvl>
+    <w:lvl w:ilvl="3" w:tentative="1">
+      <w:start w:val="1"/>
+      <w:numFmt w:val="bullet"/>
+      <w:lvlText w:val=""/>
+      <w:lvlJc w:val="left"/>
+      <w:pPr>
+        <w:tabs>
+          <w:tab w:val="num" w:pos="2880"/>
+        </w:tabs>
+        <w:ind w:left="2880" w:hanging="360"/>
+      </w:pPr>
+      <w:rPr>
+        <w:rFonts w:ascii="Wingdings" w:hAnsi="Wingdings" w:hint="default"/>
+        <w:sz w:val="20"/>
+      </w:rPr>
+    </w:lvl>
+    <w:lvl w:ilvl="4" w:tentative="1">
+      <w:start w:val="1"/>
+      <w:numFmt w:val="bullet"/>
+      <w:lvlText w:val=""/>
+      <w:lvlJc w:val="left"/>
+      <w:pPr>
+        <w:tabs>
+          <w:tab w:val="num" w:pos="3600"/>
+        </w:tabs>
+        <w:ind w:left="3600" w:hanging="360"/>
+      </w:pPr>
+      <w:rPr>
+        <w:rFonts w:ascii="Wingdings" w:hAnsi="Wingdings" w:hint="default"/>
+        <w:sz w:val="20"/>
+      </w:rPr>
+    </w:lvl>
+    <w:lvl w:ilvl="5" w:tentative="1">
+      <w:start w:val="1"/>
+      <w:numFmt w:val="bullet"/>
+      <w:lvlText w:val=""/>
+      <w:lvlJc w:val="left"/>
+      <w:pPr>
+        <w:tabs>
+          <w:tab w:val="num" w:pos="4320"/>
+        </w:tabs>
+        <w:ind w:left="4320" w:hanging="360"/>
+      </w:pPr>
+      <w:rPr>
+        <w:rFonts w:ascii="Wingdings" w:hAnsi="Wingdings" w:hint="default"/>
+        <w:sz w:val="20"/>
+      </w:rPr>
+    </w:lvl>
+    <w:lvl w:ilvl="6" w:tentative="1">
+      <w:start w:val="1"/>
+      <w:numFmt w:val="bullet"/>
+      <w:lvlText w:val=""/>
+      <w:lvlJc w:val="left"/>
+      <w:pPr>
+        <w:tabs>
+          <w:tab w:val="num" w:pos="5040"/>
+        </w:tabs>
+        <w:ind w:left="5040" w:hanging="360"/>
+      </w:pPr>
+      <w:rPr>
+        <w:rFonts w:ascii="Wingdings" w:hAnsi="Wingdings" w:hint="default"/>
+        <w:sz w:val="20"/>
+      </w:rPr>
+    </w:lvl>
+    <w:lvl w:ilvl="7" w:tentative="1">
+      <w:start w:val="1"/>
+      <w:numFmt w:val="bullet"/>
+      <w:lvlText w:val=""/>
+      <w:lvlJc w:val="left"/>
+      <w:pPr>
+        <w:tabs>
+          <w:tab w:val="num" w:pos="5760"/>
+        </w:tabs>
+        <w:ind w:left="5760" w:hanging="360"/>
+      </w:pPr>
+      <w:rPr>
+        <w:rFonts w:ascii="Wingdings" w:hAnsi="Wingdings" w:hint="default"/>
+        <w:sz w:val="20"/>
+      </w:rPr>
+    </w:lvl>
+    <w:lvl w:ilvl="8" w:tentative="1">
+      <w:start w:val="1"/>
+      <w:numFmt w:val="bullet"/>
+      <w:lvlText w:val=""/>
+      <w:lvlJc w:val="left"/>
+      <w:pPr>
+        <w:tabs>
+          <w:tab w:val="num" w:pos="6480"/>
+        </w:tabs>
+        <w:ind w:left="6480" w:hanging="360"/>
+      </w:pPr>
+      <w:rPr>
+        <w:rFonts w:ascii="Wingdings" w:hAnsi="Wingdings" w:hint="default"/>
+        <w:sz w:val="20"/>
+      </w:rPr>
+    </w:lvl>
+  </w:abstractNum>
+  <w:abstractNum w:abstractNumId="3" w15:restartNumberingAfterBreak="0">
+    <w:nsid w:val="6FD0465B"/>
+    <w:multiLevelType w:val="multilevel"/>
+    <w:tmpl w:val="B308D16C"/>
+    <w:lvl w:ilvl="0">
+      <w:start w:val="1"/>
+      <w:numFmt w:val="decimal"/>
+      <w:lvlText w:val="%1."/>
+      <w:lvlJc w:val="left"/>
+      <w:pPr>
+        <w:tabs>
+          <w:tab w:val="num" w:pos="720"/>
+        </w:tabs>
+        <w:ind w:left="720" w:hanging="360"/>
+      </w:pPr>
+    </w:lvl>
+    <w:lvl w:ilvl="1" w:tentative="1">
+      <w:start w:val="1"/>
+      <w:numFmt w:val="decimal"/>
+      <w:lvlText w:val="%2."/>
+      <w:lvlJc w:val="left"/>
+      <w:pPr>
+        <w:tabs>
+          <w:tab w:val="num" w:pos="1440"/>
+        </w:tabs>
+        <w:ind w:left="1440" w:hanging="360"/>
+      </w:pPr>
+    </w:lvl>
+    <w:lvl w:ilvl="2" w:tentative="1">
+      <w:start w:val="1"/>
+      <w:numFmt w:val="decimal"/>
+      <w:lvlText w:val="%3."/>
+      <w:lvlJc w:val="left"/>
+      <w:pPr>
+        <w:tabs>
+          <w:tab w:val="num" w:pos="2160"/>
+        </w:tabs>
+        <w:ind w:left="2160" w:hanging="360"/>
+      </w:pPr>
+    </w:lvl>
+    <w:lvl w:ilvl="3" w:tentative="1">
+      <w:start w:val="1"/>
+      <w:numFmt w:val="decimal"/>
+      <w:lvlText w:val="%4."/>
+      <w:lvlJc w:val="left"/>
+      <w:pPr>
+        <w:tabs>
+          <w:tab w:val="num" w:pos="2880"/>
+        </w:tabs>
+        <w:ind w:left="2880" w:hanging="360"/>
+      </w:pPr>
+    </w:lvl>
+    <w:lvl w:ilvl="4" w:tentative="1">
+      <w:start w:val="1"/>
+      <w:numFmt w:val="decimal"/>
+      <w:lvlText w:val="%5."/>
+      <w:lvlJc w:val="left"/>
+      <w:pPr>
+        <w:tabs>
+          <w:tab w:val="num" w:pos="3600"/>
+        </w:tabs>
+        <w:ind w:left="3600" w:hanging="360"/>
+      </w:pPr>
+    </w:lvl>
+    <w:lvl w:ilvl="5" w:tentative="1">
+      <w:start w:val="1"/>
+      <w:numFmt w:val="decimal"/>
+      <w:lvlText w:val="%6."/>
+      <w:lvlJc w:val="left"/>
+      <w:pPr>
+        <w:tabs>
+          <w:tab w:val="num" w:pos="4320"/>
+        </w:tabs>
+        <w:ind w:left="4320" w:hanging="360"/>
+      </w:pPr>
+    </w:lvl>
+    <w:lvl w:ilvl="6" w:tentative="1">
+      <w:start w:val="1"/>
+      <w:numFmt w:val="decimal"/>
+      <w:lvlText w:val="%7."/>
+      <w:lvlJc w:val="left"/>
+      <w:pPr>
+        <w:tabs>
+          <w:tab w:val="num" w:pos="5040"/>
+        </w:tabs>
+        <w:ind w:left="5040" w:hanging="360"/>
+      </w:pPr>
+    </w:lvl>
+    <w:lvl w:ilvl="7" w:tentative="1">
+      <w:start w:val="1"/>
+      <w:numFmt w:val="decimal"/>
+      <w:lvlText w:val="%8."/>
+      <w:lvlJc w:val="left"/>
+      <w:pPr>
+        <w:tabs>
+          <w:tab w:val="num" w:pos="5760"/>
+        </w:tabs>
+        <w:ind w:left="5760" w:hanging="360"/>
+      </w:pPr>
+    </w:lvl>
+    <w:lvl w:ilvl="8" w:tentative="1">
+      <w:start w:val="1"/>
+      <w:numFmt w:val="decimal"/>
+      <w:lvlText w:val="%9."/>
+      <w:lvlJc w:val="left"/>
+      <w:pPr>
+        <w:tabs>
+          <w:tab w:val="num" w:pos="6480"/>
+        </w:tabs>
+        <w:ind w:left="6480" w:hanging="360"/>
+      </w:pPr>
+    </w:lvl>
+  </w:abstractNum>
+  <w:num w:numId="1" w16cid:durableId="1351418699">
+    <w:abstractNumId w:val="0"/>
+  </w:num>
+  <w:num w:numId="2" w16cid:durableId="2097707303">
+    <w:abstractNumId w:val="1"/>
+  </w:num>
+  <w:num w:numId="3" w16cid:durableId="588925241">
+    <w:abstractNumId w:val="2"/>
+  </w:num>
+  <w:num w:numId="4" w16cid:durableId="1304383264">
+    <w:abstractNumId w:val="3"/>
+  </w:num>
+</w:numbering>
 </file>
 
 <file path=word/styles.xml><?xml version="1.0" encoding="utf-8"?>
@@ -1124,6 +3043,69 @@
       <w14:ligatures w14:val="none"/>
     </w:rPr>
   </w:style>
+  <w:style w:type="paragraph" w:styleId="Ttulo1">
+    <w:name w:val="heading 1"/>
+    <w:basedOn w:val="Normal"/>
+    <w:link w:val="Ttulo1Car"/>
+    <w:uiPriority w:val="9"/>
+    <w:qFormat/>
+    <w:rsid w:val="00DF57DC"/>
+    <w:pPr>
+      <w:spacing w:after="0" w:line="240" w:lineRule="auto"/>
+      <w:ind w:firstLine="0"/>
+      <w:outlineLvl w:val="0"/>
+    </w:pPr>
+    <w:rPr>
+      <w:rFonts w:ascii="Arial" w:eastAsia="Times New Roman" w:hAnsi="Arial" w:cs="Arial"/>
+      <w:b/>
+      <w:bCs/>
+      <w:sz w:val="32"/>
+      <w:szCs w:val="32"/>
+      <w:lang w:eastAsia="es-MX"/>
+    </w:rPr>
+  </w:style>
+  <w:style w:type="paragraph" w:styleId="Ttulo2">
+    <w:name w:val="heading 2"/>
+    <w:basedOn w:val="Normal"/>
+    <w:link w:val="Ttulo2Car"/>
+    <w:uiPriority w:val="9"/>
+    <w:qFormat/>
+    <w:rsid w:val="00DF57DC"/>
+    <w:pPr>
+      <w:spacing w:after="0" w:line="240" w:lineRule="auto"/>
+      <w:ind w:firstLine="0"/>
+      <w:outlineLvl w:val="1"/>
+    </w:pPr>
+    <w:rPr>
+      <w:rFonts w:ascii="Arial" w:eastAsia="Times New Roman" w:hAnsi="Arial" w:cs="Arial"/>
+      <w:b/>
+      <w:bCs/>
+      <w:sz w:val="27"/>
+      <w:szCs w:val="27"/>
+      <w:lang w:eastAsia="es-MX"/>
+    </w:rPr>
+  </w:style>
+  <w:style w:type="paragraph" w:styleId="Ttulo3">
+    <w:name w:val="heading 3"/>
+    <w:basedOn w:val="Normal"/>
+    <w:link w:val="Ttulo3Car"/>
+    <w:uiPriority w:val="9"/>
+    <w:qFormat/>
+    <w:rsid w:val="00DF57DC"/>
+    <w:pPr>
+      <w:spacing w:before="100" w:beforeAutospacing="1" w:after="100" w:afterAutospacing="1" w:line="240" w:lineRule="auto"/>
+      <w:ind w:firstLine="0"/>
+      <w:outlineLvl w:val="2"/>
+    </w:pPr>
+    <w:rPr>
+      <w:rFonts w:ascii="Times New Roman" w:eastAsia="Times New Roman" w:hAnsi="Times New Roman" w:cs="Times New Roman"/>
+      <w:b/>
+      <w:bCs/>
+      <w:sz w:val="27"/>
+      <w:szCs w:val="27"/>
+      <w:lang w:eastAsia="es-MX"/>
+    </w:rPr>
+  </w:style>
   <w:style w:type="character" w:default="1" w:styleId="Fuentedeprrafopredeter">
     <w:name w:val="Default Paragraph Font"/>
     <w:uiPriority w:val="1"/>
@@ -1178,6 +3160,70 @@
       <w:kern w:val="0"/>
       <w:lang w:eastAsia="es-MX"/>
       <w14:ligatures w14:val="none"/>
+    </w:rPr>
+  </w:style>
+  <w:style w:type="character" w:customStyle="1" w:styleId="Ttulo1Car">
+    <w:name w:val="Título 1 Car"/>
+    <w:basedOn w:val="Fuentedeprrafopredeter"/>
+    <w:link w:val="Ttulo1"/>
+    <w:uiPriority w:val="9"/>
+    <w:rsid w:val="00DF57DC"/>
+    <w:rPr>
+      <w:rFonts w:ascii="Arial" w:eastAsia="Times New Roman" w:hAnsi="Arial" w:cs="Arial"/>
+      <w:b/>
+      <w:bCs/>
+      <w:kern w:val="0"/>
+      <w:sz w:val="32"/>
+      <w:szCs w:val="32"/>
+      <w:lang w:eastAsia="es-MX"/>
+      <w14:ligatures w14:val="none"/>
+    </w:rPr>
+  </w:style>
+  <w:style w:type="character" w:customStyle="1" w:styleId="Ttulo2Car">
+    <w:name w:val="Título 2 Car"/>
+    <w:basedOn w:val="Fuentedeprrafopredeter"/>
+    <w:link w:val="Ttulo2"/>
+    <w:uiPriority w:val="9"/>
+    <w:rsid w:val="00DF57DC"/>
+    <w:rPr>
+      <w:rFonts w:ascii="Arial" w:eastAsia="Times New Roman" w:hAnsi="Arial" w:cs="Arial"/>
+      <w:b/>
+      <w:bCs/>
+      <w:kern w:val="0"/>
+      <w:sz w:val="27"/>
+      <w:szCs w:val="27"/>
+      <w:lang w:eastAsia="es-MX"/>
+      <w14:ligatures w14:val="none"/>
+    </w:rPr>
+  </w:style>
+  <w:style w:type="character" w:customStyle="1" w:styleId="Ttulo3Car">
+    <w:name w:val="Título 3 Car"/>
+    <w:basedOn w:val="Fuentedeprrafopredeter"/>
+    <w:link w:val="Ttulo3"/>
+    <w:uiPriority w:val="9"/>
+    <w:rsid w:val="00DF57DC"/>
+    <w:rPr>
+      <w:rFonts w:ascii="Times New Roman" w:eastAsia="Times New Roman" w:hAnsi="Times New Roman" w:cs="Times New Roman"/>
+      <w:b/>
+      <w:bCs/>
+      <w:kern w:val="0"/>
+      <w:sz w:val="27"/>
+      <w:szCs w:val="27"/>
+      <w:lang w:eastAsia="es-MX"/>
+      <w14:ligatures w14:val="none"/>
+    </w:rPr>
+  </w:style>
+  <w:style w:type="character" w:styleId="CdigoHTML">
+    <w:name w:val="HTML Code"/>
+    <w:basedOn w:val="Fuentedeprrafopredeter"/>
+    <w:uiPriority w:val="99"/>
+    <w:semiHidden/>
+    <w:unhideWhenUsed/>
+    <w:rsid w:val="00DF57DC"/>
+    <w:rPr>
+      <w:rFonts w:ascii="Courier New" w:eastAsia="Times New Roman" w:hAnsi="Courier New" w:cs="Courier New"/>
+      <w:sz w:val="20"/>
+      <w:szCs w:val="20"/>
     </w:rPr>
   </w:style>
 </w:styles>

</xml_diff>